<commit_message>
feat(ct01): download residence form with lease and legal owner details
Keep original font sizes and use Times New Roman in both forms. Add 12/24 month choice, resolve the active room, map legal owner and customer fields, and use the request date across async download work.

Add owner entry to building create and both edit flows with load error and partial-save retry handling. Verified 19 tests, 6 browser download cases, rendered Word pages, real helper/JWT isolation and PostgREST owner persistence, typecheck, 42 prepush gates, build and bundle.

Co-Authored-By: Codex <noreply@openai.com>
</commit_message>
<xml_diff>
--- a/public/templates/ct01.docx
+++ b/public/templates/ct01.docx
@@ -209,7 +209,7 @@
           <w:sz w:val="26"/>
           <w:szCs w:val="26"/>
         </w:rPr>
-        <w:pict w14:anchorId="2609532F">
+        <w:pict w14:anchorId="41602B7E">
           <v:shapetype id="_x0000_t32" coordsize="21600,21600" o:spt="32" o:oned="t" path="m,l21600,21600e" filled="f">
             <v:path arrowok="t" fillok="f" o:connecttype="none"/>
             <o:lock v:ext="edit" shapetype="t"/>
@@ -803,7 +803,88 @@
           <w:szCs w:val="26"/>
           <w:lang w:val="pt-BR"/>
         </w:rPr>
-        <w:t xml:space="preserve">5. Số điện thoại liên hệ: {phone}     6. Email: {email}</w:t>
+        <w:t>5</w:t>
+      </w:r>
+      <w:r>
+        <w:rPr>
+          <w:rFonts w:ascii="Times New Roman" w:eastAsia="Times New Roman" w:hAnsi="Times New Roman"/>
+          <w:sz w:val="26"/>
+          <w:szCs w:val="26"/>
+          <w:lang w:val="vi-VN"/>
+        </w:rPr>
+        <w:t xml:space="preserve">. </w:t>
+      </w:r>
+      <w:r>
+        <w:rPr>
+          <w:rFonts w:ascii="Times New Roman" w:eastAsia="Times New Roman" w:hAnsi="Times New Roman"/>
+          <w:sz w:val="26"/>
+          <w:szCs w:val="26"/>
+          <w:lang w:val="pt-BR"/>
+        </w:rPr>
+        <w:t>Số điện thoại</w:t>
+      </w:r>
+      <w:r>
+        <w:rPr>
+          <w:rFonts w:ascii="Times New Roman" w:eastAsia="Times New Roman" w:hAnsi="Times New Roman"/>
+          <w:sz w:val="26"/>
+          <w:szCs w:val="26"/>
+          <w:lang w:val="vi-VN"/>
+        </w:rPr>
+        <w:t xml:space="preserve"> liên hệ</w:t>
+      </w:r>
+      <w:r>
+        <w:rPr>
+          <w:rFonts w:ascii="Times New Roman" w:eastAsia="Times New Roman" w:hAnsi="Times New Roman"/>
+          <w:sz w:val="24"/>
+          <w:szCs w:val="16"/>
+          <w:lang w:val="vi-VN"/>
+        </w:rPr>
+        <w:t>:</w:t>
+      </w:r>
+      <w:r>
+        <w:rPr>
+          <w:rFonts w:ascii="Times New Roman" w:eastAsia="Times New Roman" w:hAnsi="Times New Roman"/>
+          <w:sz w:val="24"/>
+          <w:szCs w:val="24"/>
+          <w:lang w:val="vi-VN"/>
+        </w:rPr>
+        <w:t xml:space="preserve"> {phone}     </w:t>
+      </w:r>
+      <w:r>
+        <w:rPr>
+          <w:rFonts w:ascii="Times New Roman" w:eastAsia="Times New Roman" w:hAnsi="Times New Roman"/>
+          <w:sz w:val="26"/>
+          <w:szCs w:val="26"/>
+          <w:lang w:val="pt-BR"/>
+        </w:rPr>
+        <w:t>6</w:t>
+      </w:r>
+      <w:r>
+        <w:rPr>
+          <w:rFonts w:ascii="Times New Roman" w:eastAsia="Times New Roman" w:hAnsi="Times New Roman"/>
+          <w:sz w:val="26"/>
+          <w:szCs w:val="26"/>
+          <w:lang w:val="vi-VN"/>
+        </w:rPr>
+        <w:t>. Email</w:t>
+      </w:r>
+      <w:r>
+        <w:rPr>
+          <w:rFonts w:ascii="Times New Roman" w:eastAsia="Times New Roman" w:hAnsi="Times New Roman"/>
+          <w:sz w:val="24"/>
+          <w:szCs w:val="16"/>
+          <w:lang w:val="vi-VN"/>
+        </w:rPr>
+        <w:t>:</w:t>
+      </w:r>
+      <w:r>
+        <w:rPr>
+          <w:rFonts w:ascii="Times New Roman" w:eastAsia="Times New Roman" w:hAnsi="Times New Roman"/>
+          <w:sz w:val="24"/>
+          <w:szCs w:val="24"/>
+          <w:lang w:val="vi-VN"/>
+        </w:rPr>
+        <w:t xml:space="preserve"> {email}</w:t>
       </w:r>
     </w:p>
     <w:p>
@@ -847,9 +928,6 @@
         <w:t xml:space="preserve"> {household_head_name}   </w:t>
       </w:r>
       <w:r>
-        <w:br/>
-      </w:r>
-      <w:r>
         <w:rPr>
           <w:rFonts w:ascii="Times New Roman" w:eastAsia="Times New Roman" w:hAnsi="Times New Roman"/>
           <w:sz w:val="26"/>
@@ -864,7 +942,7 @@
           <w:sz w:val="26"/>
           <w:szCs w:val="26"/>
         </w:rPr>
-        <w:t>: Chủ hộ</w:t>
+        <w:t>: Chủ hộ</w:t>
       </w:r>
     </w:p>
     <w:tbl>
@@ -1319,39 +1397,7 @@
           <w:szCs w:val="24"/>
           <w:lang w:val="vi-VN"/>
         </w:rPr>
-        <w:t xml:space="preserve"> Đăng ký tạm trú về địa chỉ </w:t>
-      </w:r>
-      <w:r>
-        <w:rPr>
-          <w:rFonts w:ascii="Times New Roman" w:eastAsia="Times New Roman" w:hAnsi="Times New Roman"/>
-          <w:sz w:val="24"/>
-          <w:szCs w:val="24"/>
-          <w:lang w:val="vi-VN"/>
-        </w:rPr>
-        <w:t xml:space="preserve">{building_address}</w:t>
-      </w:r>
-    </w:p>
-    <w:p>
-      <w:pPr>
-        <w:tabs>
-          <w:tab w:val="left" w:leader="dot" w:pos="9072"/>
-        </w:tabs>
-        <w:spacing w:before="160" w:line="240" w:lineRule="auto"/>
-        <w:rPr>
-          <w:rFonts w:ascii="Times New Roman" w:eastAsia="Times New Roman" w:hAnsi="Times New Roman"/>
-          <w:sz w:val="24"/>
-          <w:szCs w:val="24"/>
-          <w:lang w:val="vi-VN"/>
-        </w:rPr>
-      </w:pPr>
-      <w:r>
-        <w:rPr>
-          <w:rFonts w:ascii="Times New Roman" w:eastAsia="Times New Roman" w:hAnsi="Times New Roman"/>
-          <w:sz w:val="24"/>
-          <w:szCs w:val="24"/>
-          <w:lang w:val="vi-VN"/>
-        </w:rPr>
-        <w:tab/>
+        <w:t xml:space="preserve"> {registration_request}</w:t>
       </w:r>
     </w:p>
     <w:p>
@@ -2947,11 +2993,94 @@
             <w:r>
               <w:rPr>
                 <w:rFonts w:ascii="Times New Roman" w:eastAsia="Times New Roman" w:hAnsi="Times New Roman"/>
-                <w:sz w:val="20"/>
-                <w:szCs w:val="20"/>
-                <w:lang w:val="pt-BR"/>
-              </w:rPr>
-              <w:t xml:space="preserve">{signature_date}</w:t>
+                <w:sz w:val="24"/>
+                <w:szCs w:val="28"/>
+                <w:lang w:val="pt-BR"/>
+              </w:rPr>
+              <w:t xml:space="preserve"/>
+            </w:r>
+            <w:r>
+              <w:rPr>
+                <w:rFonts w:ascii="Times New Roman" w:eastAsia="Times New Roman" w:hAnsi="Times New Roman"/>
+                <w:i/>
+                <w:szCs w:val="28"/>
+                <w:lang w:val="pt-BR"/>
+              </w:rPr>
+              <w:t xml:space="preserve"/>
+            </w:r>
+            <w:r>
+              <w:rPr>
+                <w:rFonts w:ascii="Times New Roman" w:eastAsia="Times New Roman" w:hAnsi="Times New Roman"/>
+                <w:i/>
+                <w:szCs w:val="26"/>
+                <w:lang w:val="pt-BR"/>
+              </w:rPr>
+              <w:t>ngày</w:t>
+            </w:r>
+            <w:r>
+              <w:rPr>
+                <w:rFonts w:ascii="Times New Roman" w:eastAsia="Times New Roman" w:hAnsi="Times New Roman"/>
+                <w:sz w:val="24"/>
+                <w:szCs w:val="28"/>
+                <w:lang w:val="pt-BR"/>
+              </w:rPr>
+              <w:t xml:space="preserve"> {signature_day} </w:t>
+            </w:r>
+            <w:r>
+              <w:rPr>
+                <w:rFonts w:ascii="Times New Roman" w:eastAsia="Times New Roman" w:hAnsi="Times New Roman"/>
+                <w:i/>
+                <w:szCs w:val="28"/>
+                <w:lang w:val="pt-BR"/>
+              </w:rPr>
+              <w:t xml:space="preserve"/>
+            </w:r>
+            <w:r>
+              <w:rPr>
+                <w:rFonts w:ascii="Times New Roman" w:eastAsia="Times New Roman" w:hAnsi="Times New Roman"/>
+                <w:i/>
+                <w:szCs w:val="26"/>
+                <w:lang w:val="pt-BR"/>
+              </w:rPr>
+              <w:t>tháng</w:t>
+            </w:r>
+            <w:r>
+              <w:rPr>
+                <w:rFonts w:ascii="Times New Roman" w:eastAsia="Times New Roman" w:hAnsi="Times New Roman"/>
+                <w:i/>
+                <w:szCs w:val="28"/>
+                <w:lang w:val="pt-BR"/>
+              </w:rPr>
+              <w:t xml:space="preserve"> {signature_month} </w:t>
+            </w:r>
+            <w:r>
+              <w:rPr>
+                <w:rFonts w:ascii="Times New Roman" w:eastAsia="Times New Roman" w:hAnsi="Times New Roman"/>
+                <w:i/>
+                <w:szCs w:val="26"/>
+                <w:lang w:val="pt-BR"/>
+              </w:rPr>
+              <w:t/>
+              <w:br/>
+              <w:t xml:space="preserve">năm</w:t>
+            </w:r>
+            <w:r>
+              <w:rPr>
+                <w:rFonts w:ascii="Times New Roman" w:eastAsia="Times New Roman" w:hAnsi="Times New Roman"/>
+                <w:sz w:val="24"/>
+                <w:szCs w:val="28"/>
+                <w:lang w:val="pt-BR"/>
+              </w:rPr>
+              <w:t xml:space="preserve"> {signature_year} </w:t>
+            </w:r>
+            <w:r>
+              <w:rPr>
+                <w:rFonts w:ascii="Times New Roman" w:eastAsia="Times New Roman" w:hAnsi="Times New Roman"/>
+                <w:i/>
+                <w:szCs w:val="28"/>
+                <w:lang w:val="pt-BR"/>
+              </w:rPr>
+              <w:t xml:space="preserve"/>
             </w:r>
           </w:p>
           <w:p>
@@ -3009,11 +3138,85 @@
             <w:r>
               <w:rPr>
                 <w:rFonts w:ascii="Times New Roman" w:eastAsia="Times New Roman" w:hAnsi="Times New Roman"/>
-                <w:sz w:val="20"/>
-                <w:szCs w:val="20"/>
+                <w:sz w:val="24"/>
+                <w:szCs w:val="28"/>
                 <w:lang w:val="vi-VN"/>
               </w:rPr>
-              <w:t xml:space="preserve">{signature_date}</w:t>
+              <w:t xml:space="preserve"/>
+            </w:r>
+            <w:r>
+              <w:rPr>
+                <w:rFonts w:ascii="Times New Roman" w:eastAsia="Times New Roman" w:hAnsi="Times New Roman"/>
+                <w:i/>
+                <w:szCs w:val="28"/>
+                <w:lang w:val="vi-VN"/>
+              </w:rPr>
+              <w:t xml:space="preserve"/>
+            </w:r>
+            <w:r>
+              <w:rPr>
+                <w:rFonts w:ascii="Times New Roman" w:eastAsia="Times New Roman" w:hAnsi="Times New Roman"/>
+                <w:i/>
+                <w:szCs w:val="26"/>
+                <w:lang w:val="vi-VN"/>
+              </w:rPr>
+              <w:t>ngày</w:t>
+            </w:r>
+            <w:r>
+              <w:rPr>
+                <w:rFonts w:ascii="Times New Roman" w:eastAsia="Times New Roman" w:hAnsi="Times New Roman"/>
+                <w:sz w:val="24"/>
+                <w:szCs w:val="28"/>
+                <w:lang w:val="vi-VN"/>
+              </w:rPr>
+              <w:t xml:space="preserve"> {signature_day} </w:t>
+            </w:r>
+            <w:r>
+              <w:rPr>
+                <w:rFonts w:ascii="Times New Roman" w:eastAsia="Times New Roman" w:hAnsi="Times New Roman"/>
+                <w:i/>
+                <w:szCs w:val="28"/>
+                <w:lang w:val="vi-VN"/>
+              </w:rPr>
+              <w:t xml:space="preserve"/>
+            </w:r>
+            <w:r>
+              <w:rPr>
+                <w:rFonts w:ascii="Times New Roman" w:eastAsia="Times New Roman" w:hAnsi="Times New Roman"/>
+                <w:i/>
+                <w:szCs w:val="26"/>
+                <w:lang w:val="vi-VN"/>
+              </w:rPr>
+              <w:t>tháng</w:t>
+            </w:r>
+            <w:r>
+              <w:rPr>
+                <w:rFonts w:ascii="Times New Roman" w:eastAsia="Times New Roman" w:hAnsi="Times New Roman"/>
+                <w:i/>
+                <w:szCs w:val="28"/>
+                <w:lang w:val="vi-VN"/>
+              </w:rPr>
+              <w:t xml:space="preserve"> {signature_month} </w:t>
+            </w:r>
+            <w:r>
+              <w:rPr>
+                <w:rFonts w:ascii="Times New Roman" w:eastAsia="Times New Roman" w:hAnsi="Times New Roman"/>
+                <w:i/>
+                <w:szCs w:val="26"/>
+                <w:lang w:val="vi-VN"/>
+              </w:rPr>
+              <w:t/>
+              <w:br/>
+              <w:t xml:space="preserve">năm</w:t>
+            </w:r>
+            <w:r>
+              <w:rPr>
+                <w:rFonts w:ascii="Times New Roman" w:eastAsia="Times New Roman" w:hAnsi="Times New Roman"/>
+                <w:sz w:val="24"/>
+                <w:szCs w:val="28"/>
+                <w:lang w:val="vi-VN"/>
+              </w:rPr>
+              <w:t xml:space="preserve"> {signature_year} </w:t>
             </w:r>
           </w:p>
           <w:p>
@@ -3069,11 +3272,49 @@
             <w:r>
               <w:rPr>
                 <w:rFonts w:ascii="Times New Roman" w:eastAsia="Times New Roman" w:hAnsi="Times New Roman"/>
-                <w:sz w:val="20"/>
-                <w:szCs w:val="20"/>
+                <w:sz w:val="24"/>
+                <w:szCs w:val="16"/>
                 <w:lang w:val="vi-VN"/>
               </w:rPr>
-              <w:t xml:space="preserve">{signature_date}</w:t>
+              <w:t xml:space="preserve"/>
+            </w:r>
+            <w:r>
+              <w:rPr>
+                <w:rFonts w:ascii="Times New Roman" w:eastAsia="Times New Roman" w:hAnsi="Times New Roman"/>
+                <w:i/>
+                <w:szCs w:val="16"/>
+                <w:lang w:val="vi-VN"/>
+              </w:rPr>
+              <w:t xml:space="preserve">ngày</w:t>
+            </w:r>
+            <w:r>
+              <w:rPr>
+                <w:rFonts w:ascii="Times New Roman" w:eastAsia="Times New Roman" w:hAnsi="Times New Roman"/>
+                <w:sz w:val="24"/>
+                <w:szCs w:val="16"/>
+                <w:lang w:val="vi-VN"/>
+              </w:rPr>
+              <w:t xml:space="preserve"> {signature_day} </w:t>
+            </w:r>
+            <w:r>
+              <w:rPr>
+                <w:rFonts w:ascii="Times New Roman" w:eastAsia="Times New Roman" w:hAnsi="Times New Roman"/>
+                <w:i/>
+                <w:szCs w:val="16"/>
+                <w:lang w:val="vi-VN"/>
+              </w:rPr>
+              <w:t xml:space="preserve">tháng {signature_month} </w:t>
+              <w:br/>
+              <w:t xml:space="preserve">năm</w:t>
+            </w:r>
+            <w:r>
+              <w:rPr>
+                <w:rFonts w:ascii="Times New Roman" w:eastAsia="Times New Roman" w:hAnsi="Times New Roman"/>
+                <w:sz w:val="24"/>
+                <w:szCs w:val="16"/>
+                <w:lang w:val="vi-VN"/>
+              </w:rPr>
+              <w:t xml:space="preserve"> {signature_year} </w:t>
             </w:r>
           </w:p>
           <w:p>
@@ -3152,11 +3393,76 @@
             <w:r>
               <w:rPr>
                 <w:rFonts w:ascii="Times New Roman" w:eastAsia="Times New Roman" w:hAnsi="Times New Roman"/>
-                <w:sz w:val="20"/>
-                <w:szCs w:val="20"/>
+                <w:sz w:val="24"/>
+                <w:szCs w:val="28"/>
                 <w:lang w:val="vi-VN"/>
               </w:rPr>
-              <w:t xml:space="preserve">{signature_date}</w:t>
+              <w:t xml:space="preserve"/>
+            </w:r>
+            <w:r>
+              <w:rPr>
+                <w:rFonts w:ascii="Times New Roman" w:eastAsia="Times New Roman" w:hAnsi="Times New Roman"/>
+                <w:i/>
+                <w:szCs w:val="28"/>
+                <w:lang w:val="vi-VN"/>
+              </w:rPr>
+              <w:t xml:space="preserve"/>
+            </w:r>
+            <w:r>
+              <w:rPr>
+                <w:rFonts w:ascii="Times New Roman" w:eastAsia="Times New Roman" w:hAnsi="Times New Roman"/>
+                <w:i/>
+                <w:szCs w:val="26"/>
+                <w:lang w:val="vi-VN"/>
+              </w:rPr>
+              <w:t>ngày</w:t>
+            </w:r>
+            <w:r>
+              <w:rPr>
+                <w:rFonts w:ascii="Times New Roman" w:eastAsia="Times New Roman" w:hAnsi="Times New Roman"/>
+                <w:i/>
+                <w:szCs w:val="28"/>
+                <w:lang w:val="vi-VN"/>
+              </w:rPr>
+              <w:t xml:space="preserve"> {signature_day} </w:t>
+            </w:r>
+            <w:r>
+              <w:rPr>
+                <w:rFonts w:ascii="Times New Roman" w:eastAsia="Times New Roman" w:hAnsi="Times New Roman"/>
+                <w:i/>
+                <w:szCs w:val="26"/>
+                <w:lang w:val="vi-VN"/>
+              </w:rPr>
+              <w:t>tháng</w:t>
+            </w:r>
+            <w:r>
+              <w:rPr>
+                <w:rFonts w:ascii="Times New Roman" w:eastAsia="Times New Roman" w:hAnsi="Times New Roman"/>
+                <w:i/>
+                <w:szCs w:val="28"/>
+                <w:lang w:val="vi-VN"/>
+              </w:rPr>
+              <w:t xml:space="preserve"> {signature_month} </w:t>
+            </w:r>
+            <w:r>
+              <w:rPr>
+                <w:rFonts w:ascii="Times New Roman" w:eastAsia="Times New Roman" w:hAnsi="Times New Roman"/>
+                <w:i/>
+                <w:szCs w:val="26"/>
+                <w:lang w:val="vi-VN"/>
+              </w:rPr>
+              <w:t/>
+              <w:br/>
+              <w:t xml:space="preserve">năm</w:t>
+            </w:r>
+            <w:r>
+              <w:rPr>
+                <w:rFonts w:ascii="Times New Roman" w:eastAsia="Times New Roman" w:hAnsi="Times New Roman"/>
+                <w:sz w:val="24"/>
+                <w:szCs w:val="28"/>
+                <w:lang w:val="vi-VN"/>
+              </w:rPr>
+              <w:t xml:space="preserve"> {signature_year} </w:t>
             </w:r>
           </w:p>
           <w:p>
@@ -3196,7 +3502,7 @@
           </w:p>
         </w:tc>
         <w:trPr>
-          <w:trHeight w:val="1600" w:hRule="atLeast"/>
+          <w:trHeight w:val="1400" w:hRule="atLeast"/>
         </w:trPr>
       </w:tr>
     </w:tbl>
@@ -3205,15 +3511,536 @@
         <w:rPr>
           <w:lang w:val="vi-VN"/>
         </w:rPr>
-      </w:pPr>
+        <w:sectPr>
+          <w:headerReference w:type="default" r:id="rId10"/>
+          <w:headerReference w:type="first" r:id="rId11"/>
+          <w:pgSz w:w="11907" w:h="16840" w:code="9"/>
+          <w:pgMar w:top="567" w:right="1134" w:bottom="1134" w:left="1701" w:header="680" w:footer="680" w:gutter="0"/>
+          <w:cols w:space="720"/>
+          <w:titlePg/>
+          <w:docGrid w:linePitch="360"/>
+          <w:type w:val="nextPage"/>
+        </w:sectPr>
+      </w:pPr>
+    </w:p>
+    <w:p>
+      <w:pPr>
+        <w:pStyle w:val="LeaseNormal"/>
+        <w:jc w:val="center"/>
+        <w:rPr>
+          <w:rFonts w:ascii="Times New Roman" w:hAnsi="Times New Roman" w:eastAsia="Times New Roman" w:cs="Times New Roman"/>
+          <w:b/>
+          <w:sz w:val="24"/>
+          <w:szCs w:val="24"/>
+        </w:rPr>
+      </w:pPr>
+      <w:r>
+        <w:rPr>
+          <w:rFonts w:ascii="Times New Roman" w:hAnsi="Times New Roman" w:eastAsia="Times New Roman" w:cs="Times New Roman"/>
+          <w:b/>
+          <w:sz w:val="24"/>
+          <w:szCs w:val="24"/>
+        </w:rPr>
+        <w:t>CỘNG HÒA XÃ HỘI CHỦ NGHĨA VIỆT NAM</w:t>
+      </w:r>
+    </w:p>
+    <w:p>
+      <w:pPr>
+        <w:pStyle w:val="LeaseNormal"/>
+        <w:jc w:val="center"/>
+        <w:rPr>
+          <w:rFonts w:ascii="Times New Roman" w:hAnsi="Times New Roman" w:eastAsia="Times New Roman" w:cs="Times New Roman"/>
+          <w:u w:val="single"/>
+        </w:rPr>
+      </w:pPr>
+      <w:r>
+        <w:rPr>
+          <w:rFonts w:ascii="Times New Roman" w:hAnsi="Times New Roman" w:eastAsia="Times New Roman" w:cs="Times New Roman"/>
+          <w:u w:val="single"/>
+        </w:rPr>
+        <w:t>Độc lập – Tự do- Hạnh Phúc</w:t>
+      </w:r>
+    </w:p>
+    <w:p>
+      <w:pPr>
+        <w:pStyle w:val="LeaseNormal"/>
+        <w:jc w:val="center"/>
+        <w:rPr>
+          <w:rFonts w:ascii="Times New Roman" w:hAnsi="Times New Roman" w:eastAsia="Times New Roman" w:cs="Times New Roman"/>
+          <w:u w:val="single"/>
+        </w:rPr>
+      </w:pPr>
+    </w:p>
+    <w:p>
+      <w:pPr>
+        <w:pStyle w:val="LeaseNormal"/>
+        <w:jc w:val="center"/>
+        <w:rPr>
+          <w:rFonts w:ascii="Times New Roman" w:hAnsi="Times New Roman" w:eastAsia="Times New Roman" w:cs="Times New Roman"/>
+          <w:b/>
+          <w:sz w:val="28"/>
+          <w:szCs w:val="28"/>
+        </w:rPr>
+      </w:pPr>
+      <w:r>
+        <w:rPr>
+          <w:rFonts w:ascii="Times New Roman" w:hAnsi="Times New Roman" w:eastAsia="Times New Roman" w:cs="Times New Roman"/>
+          <w:b/>
+          <w:sz w:val="28"/>
+          <w:szCs w:val="28"/>
+        </w:rPr>
+        <w:t>HỢP ĐỒNG CHO THUÊ NHÀ Ở</w:t>
+      </w:r>
+    </w:p>
+    <w:p>
+      <w:pPr>
+        <w:pStyle w:val="LeaseNormal"/>
+        <w:rPr>
+          <w:rFonts w:ascii="Times New Roman" w:hAnsi="Times New Roman" w:eastAsia="Times New Roman" w:cs="Times New Roman"/>
+        </w:rPr>
+      </w:pPr>
+      <w:r>
+        <w:rPr>
+          <w:rFonts w:ascii="Times New Roman" w:hAnsi="Times New Roman" w:eastAsia="Times New Roman" w:cs="Times New Roman"/>
+        </w:rPr>
+        <w:t xml:space="preserve">Ngày {signature_day} tháng {signature_month} năm {signature_year}</w:t>
+      </w:r>
+    </w:p>
+    <w:p>
+      <w:pPr>
+        <w:pStyle w:val="LeaseNormal"/>
+        <w:rPr>
+          <w:rFonts w:ascii="Times New Roman" w:hAnsi="Times New Roman" w:eastAsia="Times New Roman" w:cs="Times New Roman"/>
+        </w:rPr>
+      </w:pPr>
+      <w:r>
+        <w:rPr>
+          <w:rFonts w:ascii="Times New Roman" w:hAnsi="Times New Roman" w:eastAsia="Times New Roman" w:cs="Times New Roman"/>
+        </w:rPr>
+        <w:t xml:space="preserve">Tại nhà số: {building_address}</w:t>
+      </w:r>
+    </w:p>
+    <w:p>
+      <w:pPr>
+        <w:pStyle w:val="LeaseNormal"/>
+        <w:rPr>
+          <w:rFonts w:ascii="Times New Roman" w:hAnsi="Times New Roman" w:eastAsia="Times New Roman" w:cs="Times New Roman"/>
+        </w:rPr>
+      </w:pPr>
+      <w:r>
+        <w:rPr>
+          <w:rFonts w:ascii="Times New Roman" w:hAnsi="Times New Roman" w:eastAsia="Times New Roman" w:cs="Times New Roman"/>
+        </w:rPr>
+        <w:t>Chúng tôi gồm:</w:t>
+      </w:r>
+    </w:p>
+    <w:p>
+      <w:pPr>
+        <w:pStyle w:val="LeaseListParagraph"/>
+        <w:numPr>
+          <w:ilvl w:val="0"/>
+          <w:numId w:val="1"/>
+        </w:numPr>
+        <w:ind w:left="142" w:hanging="142"/>
+        <w:rPr>
+          <w:rFonts w:ascii="Times New Roman" w:hAnsi="Times New Roman" w:eastAsia="Times New Roman" w:cs="Times New Roman"/>
+        </w:rPr>
+      </w:pPr>
+      <w:r>
+        <w:rPr>
+          <w:rFonts w:ascii="Times New Roman" w:hAnsi="Times New Roman" w:eastAsia="Times New Roman" w:cs="Times New Roman"/>
+        </w:rPr>
+        <w:t>ĐẠI DIỆN CHO THUÊ, MƯỢN, Ở NHỜ (Gọi tắt là bên A):</w:t>
+      </w:r>
+    </w:p>
+    <w:p>
+      <w:pPr>
+        <w:pStyle w:val="LeaseListParagraph"/>
+        <w:numPr>
+          <w:ilvl w:val="0"/>
+          <w:numId w:val="3"/>
+        </w:numPr>
+        <w:ind w:left="360"/>
+        <w:rPr>
+          <w:rFonts w:ascii="Times New Roman" w:hAnsi="Times New Roman" w:eastAsia="Times New Roman" w:cs="Times New Roman"/>
+        </w:rPr>
+      </w:pPr>
+      <w:r>
+        <w:rPr>
+          <w:rFonts w:ascii="Times New Roman" w:hAnsi="Times New Roman" w:eastAsia="Times New Roman" w:cs="Times New Roman"/>
+        </w:rPr>
+        <w:t xml:space="preserve">Ông (Bà): {owner_name}    Sinh Năm: {owner_birth_year}</w:t>
+      </w:r>
+    </w:p>
+    <w:p>
+      <w:pPr>
+        <w:pStyle w:val="LeaseListParagraph"/>
+        <w:numPr>
+          <w:ilvl w:val="0"/>
+          <w:numId w:val="3"/>
+        </w:numPr>
+        <w:ind w:left="284" w:hanging="284"/>
+        <w:rPr>
+          <w:rFonts w:ascii="Times New Roman" w:hAnsi="Times New Roman" w:eastAsia="Times New Roman" w:cs="Times New Roman"/>
+        </w:rPr>
+      </w:pPr>
+      <w:r>
+        <w:rPr>
+          <w:rFonts w:ascii="Times New Roman" w:hAnsi="Times New Roman" w:eastAsia="Times New Roman" w:cs="Times New Roman"/>
+        </w:rPr>
+        <w:t xml:space="preserve">CCCD: {owner_id_number}    Ngày cấp: {owner_id_issue_date}    Nơi Cấp: {owner_id_issue_place}</w:t>
+      </w:r>
+    </w:p>
+    <w:p>
+      <w:pPr>
+        <w:pStyle w:val="LeaseListParagraph"/>
+        <w:numPr>
+          <w:ilvl w:val="0"/>
+          <w:numId w:val="3"/>
+        </w:numPr>
+        <w:ind w:left="284" w:hanging="284"/>
+        <w:rPr>
+          <w:rFonts w:ascii="Times New Roman" w:hAnsi="Times New Roman" w:eastAsia="Times New Roman" w:cs="Times New Roman"/>
+        </w:rPr>
+      </w:pPr>
+      <w:r>
+        <w:rPr>
+          <w:rFonts w:ascii="Times New Roman" w:hAnsi="Times New Roman" w:eastAsia="Times New Roman" w:cs="Times New Roman"/>
+        </w:rPr>
+        <w:t xml:space="preserve">Hiện thường trú: {owner_permanent_address}</w:t>
+      </w:r>
+    </w:p>
+    <w:p>
+      <w:pPr>
+        <w:pStyle w:val="LeaseListParagraph"/>
+        <w:numPr>
+          <w:ilvl w:val="0"/>
+          <w:numId w:val="3"/>
+        </w:numPr>
+        <w:ind w:left="284" w:hanging="284"/>
+        <w:rPr>
+          <w:rFonts w:ascii="Times New Roman" w:hAnsi="Times New Roman" w:eastAsia="Times New Roman" w:cs="Times New Roman"/>
+        </w:rPr>
+      </w:pPr>
+      <w:r>
+        <w:rPr>
+          <w:rFonts w:ascii="Times New Roman" w:hAnsi="Times New Roman" w:eastAsia="Times New Roman" w:cs="Times New Roman"/>
+        </w:rPr>
+        <w:t xml:space="preserve">Là chủ sở hữu căn nhà: </w:t>
+      </w:r>
+      <w:r>
+        <w:rPr>
+          <w:rFonts w:ascii="Times New Roman" w:hAnsi="Times New Roman" w:eastAsia="Times New Roman" w:cs="Times New Roman"/>
+        </w:rPr>
+        <w:t xml:space="preserve">{building_address}</w:t>
+      </w:r>
+    </w:p>
+    <w:p>
+      <w:pPr>
+        <w:pStyle w:val="LeaseListParagraph"/>
+        <w:numPr>
+          <w:ilvl w:val="0"/>
+          <w:numId w:val="1"/>
+        </w:numPr>
+        <w:ind w:left="284" w:hanging="284"/>
+        <w:rPr>
+          <w:rFonts w:ascii="Times New Roman" w:hAnsi="Times New Roman" w:eastAsia="Times New Roman" w:cs="Times New Roman"/>
+        </w:rPr>
+      </w:pPr>
+      <w:r>
+        <w:rPr>
+          <w:rFonts w:ascii="Times New Roman" w:hAnsi="Times New Roman" w:eastAsia="Times New Roman" w:cs="Times New Roman"/>
+        </w:rPr>
+        <w:t>ĐẠI DIỆN BÊN THUÊ, MƯỢN, Ở NHỜ (Gọi tắt là bên B):</w:t>
+      </w:r>
+    </w:p>
+    <w:p>
+      <w:pPr>
+        <w:pStyle w:val="LeaseListParagraph"/>
+        <w:numPr>
+          <w:ilvl w:val="0"/>
+          <w:numId w:val="4"/>
+        </w:numPr>
+        <w:ind w:left="284" w:hanging="284"/>
+        <w:rPr>
+          <w:rFonts w:ascii="Times New Roman" w:hAnsi="Times New Roman" w:eastAsia="Times New Roman" w:cs="Times New Roman"/>
+        </w:rPr>
+      </w:pPr>
+      <w:r>
+        <w:rPr>
+          <w:rFonts w:ascii="Times New Roman" w:hAnsi="Times New Roman" w:eastAsia="Times New Roman" w:cs="Times New Roman"/>
+        </w:rPr>
+        <w:t xml:space="preserve">Ông (Bà): {full_name}    Sinh năm: {customer_birth_year}</w:t>
+      </w:r>
+    </w:p>
+    <w:p>
+      <w:pPr>
+        <w:pStyle w:val="LeaseListParagraph"/>
+        <w:numPr>
+          <w:ilvl w:val="0"/>
+          <w:numId w:val="3"/>
+        </w:numPr>
+        <w:ind w:left="284" w:hanging="284"/>
+        <w:rPr>
+          <w:rFonts w:ascii="Times New Roman" w:hAnsi="Times New Roman" w:eastAsia="Times New Roman" w:cs="Times New Roman"/>
+        </w:rPr>
+      </w:pPr>
+      <w:r>
+        <w:rPr>
+          <w:rFonts w:ascii="Times New Roman" w:hAnsi="Times New Roman" w:eastAsia="Times New Roman" w:cs="Times New Roman"/>
+        </w:rPr>
+        <w:t xml:space="preserve">CCCD: {customer_id_number}    Ngày cấp: {customer_id_issue_date}    Nơi cấp: {customer_id_issue_place}</w:t>
+      </w:r>
+    </w:p>
+    <w:p>
+      <w:pPr>
+        <w:pStyle w:val="LeaseListParagraph"/>
+        <w:numPr>
+          <w:ilvl w:val="0"/>
+          <w:numId w:val="3"/>
+        </w:numPr>
+        <w:ind w:left="284" w:hanging="284"/>
+        <w:rPr>
+          <w:rFonts w:ascii="Times New Roman" w:hAnsi="Times New Roman" w:eastAsia="Times New Roman" w:cs="Times New Roman"/>
+        </w:rPr>
+      </w:pPr>
+      <w:r>
+        <w:rPr>
+          <w:rFonts w:ascii="Times New Roman" w:hAnsi="Times New Roman" w:eastAsia="Times New Roman" w:cs="Times New Roman"/>
+        </w:rPr>
+        <w:t xml:space="preserve">Hiện thường trú: {customer_permanent_address}</w:t>
+      </w:r>
+    </w:p>
+    <w:p>
+      <w:pPr>
+        <w:pStyle w:val="LeaseNormal"/>
+        <w:rPr>
+          <w:rFonts w:ascii="Times New Roman" w:hAnsi="Times New Roman" w:eastAsia="Times New Roman" w:cs="Times New Roman"/>
+        </w:rPr>
+      </w:pPr>
+      <w:r>
+        <w:rPr>
+          <w:rFonts w:ascii="Times New Roman" w:hAnsi="Times New Roman" w:eastAsia="Times New Roman" w:cs="Times New Roman"/>
+        </w:rPr>
+        <w:t>Hai bên tự nguyện thỏa thuận giao kết hợp đồng cho thuê, mượn, ở nhờ với các nội dụng sau:</w:t>
+      </w:r>
+    </w:p>
+    <w:p>
+      <w:pPr>
+        <w:pStyle w:val="LeaseNormal"/>
+        <w:rPr>
+          <w:rFonts w:ascii="Times New Roman" w:hAnsi="Times New Roman" w:eastAsia="Times New Roman" w:cs="Times New Roman"/>
+        </w:rPr>
+      </w:pPr>
+      <w:r>
+        <w:rPr>
+          <w:rFonts w:ascii="Times New Roman" w:hAnsi="Times New Roman" w:eastAsia="Times New Roman" w:cs="Times New Roman"/>
+          <w:b/>
+        </w:rPr>
+        <w:t xml:space="preserve">Điều 1: </w:t>
+      </w:r>
+      <w:r>
+        <w:rPr>
+          <w:rFonts w:ascii="Times New Roman" w:hAnsi="Times New Roman" w:eastAsia="Times New Roman" w:cs="Times New Roman"/>
+        </w:rPr>
+        <w:t>Bên A đồng ý cho bên B thuê, mượn, ở nhờ và đăng ký tạm trú tại phòng</w:t>
+      </w:r>
+      <w:r>
+        <w:rPr>
+          <w:rFonts w:ascii="Times New Roman" w:hAnsi="Times New Roman" w:eastAsia="Times New Roman" w:cs="Times New Roman"/>
+        </w:rPr>
+        <w:t xml:space="preserve"> </w:t>
+      </w:r>
+      <w:r>
+        <w:rPr>
+          <w:rFonts w:ascii="Times New Roman" w:hAnsi="Times New Roman" w:eastAsia="Times New Roman" w:cs="Times New Roman"/>
+        </w:rPr>
+        <w:t xml:space="preserve">{room_number}</w:t>
+      </w:r>
+    </w:p>
+    <w:p>
+      <w:pPr>
+        <w:pStyle w:val="LeaseNormal"/>
+        <w:rPr>
+          <w:rFonts w:ascii="Times New Roman" w:hAnsi="Times New Roman" w:eastAsia="Times New Roman" w:cs="Times New Roman"/>
+        </w:rPr>
+      </w:pPr>
+      <w:r>
+        <w:rPr>
+          <w:rFonts w:ascii="Times New Roman" w:hAnsi="Times New Roman" w:eastAsia="Times New Roman" w:cs="Times New Roman"/>
+        </w:rPr>
+        <w:t xml:space="preserve">Căn nhà số: </w:t>
+      </w:r>
+      <w:r>
+        <w:rPr>
+          <w:rFonts w:ascii="Times New Roman" w:hAnsi="Times New Roman" w:eastAsia="Times New Roman" w:cs="Times New Roman"/>
+        </w:rPr>
+        <w:t xml:space="preserve">{building_address}</w:t>
+      </w:r>
+    </w:p>
+    <w:p>
+      <w:pPr>
+        <w:pStyle w:val="LeaseNormal"/>
+        <w:rPr>
+          <w:rFonts w:ascii="Times New Roman" w:hAnsi="Times New Roman" w:eastAsia="Times New Roman" w:cs="Times New Roman"/>
+        </w:rPr>
+      </w:pPr>
+      <w:r>
+        <w:rPr>
+          <w:rFonts w:ascii="Times New Roman" w:hAnsi="Times New Roman" w:eastAsia="Times New Roman" w:cs="Times New Roman"/>
+        </w:rPr>
+        <w:t>Với mục đích để ở trong thờ</w:t>
+      </w:r>
+      <w:r>
+        <w:rPr>
+          <w:rFonts w:ascii="Times New Roman" w:hAnsi="Times New Roman" w:eastAsia="Times New Roman" w:cs="Times New Roman"/>
+        </w:rPr>
+        <w:t xml:space="preserve">i gian </w:t>
+      </w:r>
+      <w:r>
+        <w:rPr>
+          <w:rFonts w:ascii="Times New Roman" w:hAnsi="Times New Roman" w:eastAsia="Times New Roman" w:cs="Times New Roman"/>
+        </w:rPr>
+        <w:t xml:space="preserve">{duration_months}</w:t>
+      </w:r>
+      <w:r>
+        <w:rPr>
+          <w:rFonts w:ascii="Times New Roman" w:hAnsi="Times New Roman" w:eastAsia="Times New Roman" w:cs="Times New Roman"/>
+        </w:rPr>
+        <w:t xml:space="preserve"> tháng, từ ngày: </w:t>
+      </w:r>
+      <w:r>
+        <w:rPr>
+          <w:rFonts w:ascii="Times New Roman" w:hAnsi="Times New Roman" w:eastAsia="Times New Roman" w:cs="Times New Roman"/>
+        </w:rPr>
+        <w:t xml:space="preserve">{download_date}</w:t>
+      </w:r>
+      <w:r>
+        <w:rPr>
+          <w:rFonts w:ascii="Times New Roman" w:hAnsi="Times New Roman" w:eastAsia="Times New Roman" w:cs="Times New Roman"/>
+        </w:rPr>
+        <w:t>.</w:t>
+      </w:r>
+    </w:p>
+    <w:p>
+      <w:pPr>
+        <w:pStyle w:val="LeaseNormal"/>
+        <w:rPr>
+          <w:rFonts w:ascii="Times New Roman" w:hAnsi="Times New Roman" w:eastAsia="Times New Roman" w:cs="Times New Roman"/>
+        </w:rPr>
+      </w:pPr>
+      <w:r>
+        <w:rPr>
+          <w:rFonts w:ascii="Times New Roman" w:hAnsi="Times New Roman" w:eastAsia="Times New Roman" w:cs="Times New Roman"/>
+          <w:b/>
+        </w:rPr>
+        <w:t xml:space="preserve">Điều 2: </w:t>
+      </w:r>
+      <w:r>
+        <w:rPr>
+          <w:rFonts w:ascii="Times New Roman" w:hAnsi="Times New Roman" w:eastAsia="Times New Roman" w:cs="Times New Roman"/>
+        </w:rPr>
+        <w:t>Giá cả cho thuê, Mượn, ở nhờ nhà được hai bên thỏa thuận</w:t>
+      </w:r>
+    </w:p>
+    <w:p>
+      <w:pPr>
+        <w:pStyle w:val="LeaseNormal"/>
+        <w:rPr>
+          <w:rFonts w:ascii="Times New Roman" w:hAnsi="Times New Roman" w:eastAsia="Times New Roman" w:cs="Times New Roman"/>
+        </w:rPr>
+      </w:pPr>
+      <w:r>
+        <w:rPr>
+          <w:rFonts w:ascii="Times New Roman" w:hAnsi="Times New Roman" w:eastAsia="Times New Roman" w:cs="Times New Roman"/>
+          <w:b/>
+        </w:rPr>
+        <w:t xml:space="preserve">Điều 3: </w:t>
+      </w:r>
+      <w:r>
+        <w:rPr>
+          <w:rFonts w:ascii="Times New Roman" w:hAnsi="Times New Roman" w:eastAsia="Times New Roman" w:cs="Times New Roman"/>
+        </w:rPr>
+        <w:t>Trách nhiệm bên A: giao phòng và trang thiết bị tiện nghi trong phòng cho bên B kể từ ngày ký hợp đồng</w:t>
+      </w:r>
+    </w:p>
+    <w:p>
+      <w:pPr>
+        <w:pStyle w:val="LeaseNormal"/>
+        <w:rPr>
+          <w:rFonts w:ascii="Times New Roman" w:hAnsi="Times New Roman" w:eastAsia="Times New Roman" w:cs="Times New Roman"/>
+        </w:rPr>
+      </w:pPr>
+      <w:r>
+        <w:rPr>
+          <w:rFonts w:ascii="Times New Roman" w:hAnsi="Times New Roman" w:eastAsia="Times New Roman" w:cs="Times New Roman"/>
+          <w:b/>
+        </w:rPr>
+        <w:t>Điều 4:</w:t>
+      </w:r>
+      <w:r>
+        <w:rPr>
+          <w:rFonts w:ascii="Times New Roman" w:hAnsi="Times New Roman" w:eastAsia="Times New Roman" w:cs="Times New Roman"/>
+        </w:rPr>
+        <w:t xml:space="preserve"> Trách nhiệm bên B: sử dụng phòng để ở đúng mục đích, nội dung và có trách nhiệm bảo quản giữ nguyên cấu trúc của phòng, đảm bảo vệ sinh, an ninh trật tự.</w:t>
+      </w:r>
+    </w:p>
+    <w:p>
+      <w:pPr>
+        <w:pStyle w:val="LeaseNormal"/>
+        <w:rPr>
+          <w:rFonts w:ascii="Times New Roman" w:hAnsi="Times New Roman" w:eastAsia="Times New Roman" w:cs="Times New Roman"/>
+        </w:rPr>
+      </w:pPr>
+      <w:r>
+        <w:rPr>
+          <w:rFonts w:ascii="Times New Roman" w:hAnsi="Times New Roman" w:eastAsia="Times New Roman" w:cs="Times New Roman"/>
+          <w:b/>
+        </w:rPr>
+        <w:t>Điều 5:</w:t>
+      </w:r>
+      <w:r>
+        <w:rPr>
+          <w:rFonts w:ascii="Times New Roman" w:hAnsi="Times New Roman" w:eastAsia="Times New Roman" w:cs="Times New Roman"/>
+        </w:rPr>
+        <w:t xml:space="preserve"> Hai bên cam kết thực hiện đầy đủ các điều khoản đã thỏa thuận trường hợp một trong 02 bên không thực hiện theo đúng các nội dung trong hợp đồng đã thỏa thuận thì phải có trách nhiệm bồi thường mọi thiệt hại gây ra.</w:t>
+      </w:r>
+    </w:p>
+    <w:p>
+      <w:pPr>
+        <w:pStyle w:val="LeaseNormal"/>
+        <w:rPr>
+          <w:rFonts w:ascii="Times New Roman" w:hAnsi="Times New Roman" w:eastAsia="Times New Roman" w:cs="Times New Roman"/>
+        </w:rPr>
+      </w:pPr>
+      <w:r>
+        <w:rPr>
+          <w:rFonts w:ascii="Times New Roman" w:hAnsi="Times New Roman" w:eastAsia="Times New Roman" w:cs="Times New Roman"/>
+        </w:rPr>
+        <w:t>Hợp đồng này được lập thành 02 bản có giá trị tương đương nhau, có hiệu lực kế từ ngày ký và được chấm dứt khi 02 bên cùng thỏa thuận, mỗi bên giữ 01 (một) bản để thực hiện ./.</w:t>
+      </w:r>
+    </w:p>
+    <w:p>
+      <w:pPr>
+        <w:pStyle w:val="LeaseNormal"/>
+        <w:rPr>
+          <w:rFonts w:ascii="Times New Roman" w:hAnsi="Times New Roman" w:eastAsia="Times New Roman" w:cs="Times New Roman"/>
+        </w:rPr>
+      </w:pPr>
+      <w:r>
+        <w:rPr>
+          <w:rFonts w:ascii="Times New Roman" w:hAnsi="Times New Roman" w:eastAsia="Times New Roman" w:cs="Times New Roman"/>
+        </w:rPr>
+        <w:t xml:space="preserve">                  BÊN A                                                                                                   BÊN B</w:t>
+      </w:r>
     </w:p>
     <w:sectPr>
-      <w:headerReference w:type="default" r:id="rId10"/>
-      <w:headerReference w:type="first" r:id="rId11"/>
-      <w:pgSz w:w="11907" w:h="16840" w:code="9"/>
-      <w:pgMar w:top="567" w:right="1134" w:bottom="1134" w:left="1701" w:header="680" w:footer="680" w:gutter="0"/>
+      <w:headerReference w:type="even" r:id="rIdLeaseHeader"/>
+      <w:headerReference w:type="first" r:id="rIdLeaseHeader"/>
+      <w:headerReference w:type="default" r:id="rIdLeaseHeader"/>
+      <w:pgSz w:w="12240" w:h="15840"/>
+      <w:pgMar w:top="1440" w:right="1440" w:bottom="1440" w:left="1440" w:header="720" w:footer="720" w:gutter="0"/>
       <w:cols w:space="720"/>
-      <w:titlePg/>
       <w:docGrid w:linePitch="360"/>
     </w:sectPr>
   </w:body>
@@ -3351,6 +4178,685 @@
     </w:pPr>
   </w:p>
 </w:hdr>
+</file>
+
+<file path=word/lease-header.xml><?xml version="1.0" encoding="utf-8"?>
+<w:hdr xmlns:w="http://schemas.openxmlformats.org/wordprocessingml/2006/main">
+  <w:p/>
+</w:hdr>
+</file>
+
+<file path=word/numbering.xml><?xml version="1.0" encoding="utf-8"?>
+<w:numbering xmlns:wpc="http://schemas.microsoft.com/office/word/2010/wordprocessingCanvas" xmlns:cx="http://schemas.microsoft.com/office/drawing/2014/chartex" xmlns:cx1="http://schemas.microsoft.com/office/drawing/2015/9/8/chartex" xmlns:cx2="http://schemas.microsoft.com/office/drawing/2015/10/21/chartex" xmlns:cx3="http://schemas.microsoft.com/office/drawing/2016/5/9/chartex" xmlns:cx4="http://schemas.microsoft.com/office/drawing/2016/5/10/chartex" xmlns:cx5="http://schemas.microsoft.com/office/drawing/2016/5/11/chartex" xmlns:cx6="http://schemas.microsoft.com/office/drawing/2016/5/12/chartex" xmlns:cx7="http://schemas.microsoft.com/office/drawing/2016/5/13/chartex" xmlns:cx8="http://schemas.microsoft.com/office/drawing/2016/5/14/chartex" xmlns:mc="http://schemas.openxmlformats.org/markup-compatibility/2006" xmlns:aink="http://schemas.microsoft.com/office/drawing/2016/ink" xmlns:am3d="http://schemas.microsoft.com/office/drawing/2017/model3d" xmlns:o="urn:schemas-microsoft-com:office:office" xmlns:oel="http://schemas.microsoft.com/office/2019/extlst" xmlns:r="http://schemas.openxmlformats.org/officeDocument/2006/relationships" xmlns:m="http://schemas.openxmlformats.org/officeDocument/2006/math" xmlns:v="urn:schemas-microsoft-com:vml" xmlns:wp14="http://schemas.microsoft.com/office/word/2010/wordprocessingDrawing" xmlns:wp="http://schemas.openxmlformats.org/drawingml/2006/wordprocessingDrawing" xmlns:w10="urn:schemas-microsoft-com:office:word" xmlns:w="http://schemas.openxmlformats.org/wordprocessingml/2006/main" xmlns:w14="http://schemas.microsoft.com/office/word/2010/wordml" xmlns:w15="http://schemas.microsoft.com/office/word/2012/wordml" xmlns:w16cex="http://schemas.microsoft.com/office/word/2018/wordml/cex" xmlns:w16cid="http://schemas.microsoft.com/office/word/2016/wordml/cid" xmlns:w16="http://schemas.microsoft.com/office/word/2018/wordml" xmlns:w16du="http://schemas.microsoft.com/office/word/2023/wordml/word16du" xmlns:w16sdtdh="http://schemas.microsoft.com/office/word/2020/wordml/sdtdatahash" xmlns:w16sdtfl="http://schemas.microsoft.com/office/word/2024/wordml/sdtformatlock" xmlns:w16se="http://schemas.microsoft.com/office/word/2015/wordml/symex" xmlns:wpg="http://schemas.microsoft.com/office/word/2010/wordprocessingGroup" xmlns:wpi="http://schemas.microsoft.com/office/word/2010/wordprocessingInk" xmlns:wne="http://schemas.microsoft.com/office/word/2006/wordml" xmlns:wps="http://schemas.microsoft.com/office/word/2010/wordprocessingShape" mc:Ignorable="w14 w15 w16se w16cid w16 w16cex w16sdtdh w16sdtfl w16du wp14">
+  <w:abstractNum w:abstractNumId="0" w15:restartNumberingAfterBreak="0">
+    <w:nsid w:val="176C4123"/>
+    <w:multiLevelType w:val="hybridMultilevel"/>
+    <w:tmpl w:val="903E2E9A"/>
+    <w:lvl w:ilvl="0" w:tplc="0409000F">
+      <w:start w:val="1"/>
+      <w:numFmt w:val="decimal"/>
+      <w:lvlText w:val="%1."/>
+      <w:lvlJc w:val="left"/>
+      <w:pPr>
+        <w:ind w:left="720" w:hanging="360"/>
+      </w:pPr>
+      <w:rPr>
+        <w:rFonts w:hint="default" w:ascii="Times New Roman" w:hAnsi="Times New Roman" w:eastAsia="Times New Roman" w:cs="Times New Roman"/>
+      </w:rPr>
+    </w:lvl>
+    <w:lvl w:ilvl="1" w:tplc="04090019" w:tentative="1">
+      <w:start w:val="1"/>
+      <w:numFmt w:val="lowerLetter"/>
+      <w:lvlText w:val="%2."/>
+      <w:lvlJc w:val="left"/>
+      <w:pPr>
+        <w:ind w:left="1440" w:hanging="360"/>
+      </w:pPr>
+    </w:lvl>
+    <w:lvl w:ilvl="2" w:tplc="0409001B" w:tentative="1">
+      <w:start w:val="1"/>
+      <w:numFmt w:val="lowerRoman"/>
+      <w:lvlText w:val="%3."/>
+      <w:lvlJc w:val="right"/>
+      <w:pPr>
+        <w:ind w:left="2160" w:hanging="180"/>
+      </w:pPr>
+    </w:lvl>
+    <w:lvl w:ilvl="3" w:tplc="0409000F" w:tentative="1">
+      <w:start w:val="1"/>
+      <w:numFmt w:val="decimal"/>
+      <w:lvlText w:val="%4."/>
+      <w:lvlJc w:val="left"/>
+      <w:pPr>
+        <w:ind w:left="2880" w:hanging="360"/>
+      </w:pPr>
+    </w:lvl>
+    <w:lvl w:ilvl="4" w:tplc="04090019" w:tentative="1">
+      <w:start w:val="1"/>
+      <w:numFmt w:val="lowerLetter"/>
+      <w:lvlText w:val="%5."/>
+      <w:lvlJc w:val="left"/>
+      <w:pPr>
+        <w:ind w:left="3600" w:hanging="360"/>
+      </w:pPr>
+    </w:lvl>
+    <w:lvl w:ilvl="5" w:tplc="0409001B" w:tentative="1">
+      <w:start w:val="1"/>
+      <w:numFmt w:val="lowerRoman"/>
+      <w:lvlText w:val="%6."/>
+      <w:lvlJc w:val="right"/>
+      <w:pPr>
+        <w:ind w:left="4320" w:hanging="180"/>
+      </w:pPr>
+    </w:lvl>
+    <w:lvl w:ilvl="6" w:tplc="0409000F" w:tentative="1">
+      <w:start w:val="1"/>
+      <w:numFmt w:val="decimal"/>
+      <w:lvlText w:val="%7."/>
+      <w:lvlJc w:val="left"/>
+      <w:pPr>
+        <w:ind w:left="5040" w:hanging="360"/>
+      </w:pPr>
+    </w:lvl>
+    <w:lvl w:ilvl="7" w:tplc="04090019" w:tentative="1">
+      <w:start w:val="1"/>
+      <w:numFmt w:val="lowerLetter"/>
+      <w:lvlText w:val="%8."/>
+      <w:lvlJc w:val="left"/>
+      <w:pPr>
+        <w:ind w:left="5760" w:hanging="360"/>
+      </w:pPr>
+    </w:lvl>
+    <w:lvl w:ilvl="8" w:tplc="0409001B" w:tentative="1">
+      <w:start w:val="1"/>
+      <w:numFmt w:val="lowerRoman"/>
+      <w:lvlText w:val="%9."/>
+      <w:lvlJc w:val="right"/>
+      <w:pPr>
+        <w:ind w:left="6480" w:hanging="180"/>
+      </w:pPr>
+    </w:lvl>
+  </w:abstractNum>
+  <w:abstractNum w:abstractNumId="1" w15:restartNumberingAfterBreak="0">
+    <w:nsid w:val="21EE6724"/>
+    <w:multiLevelType w:val="hybridMultilevel"/>
+    <w:tmpl w:val="61DA4862"/>
+    <w:lvl w:ilvl="0" w:tplc="D48EF04E">
+      <w:start w:val="1"/>
+      <w:numFmt w:val="bullet"/>
+      <w:lvlText w:val="-"/>
+      <w:lvlJc w:val="left"/>
+      <w:pPr>
+        <w:ind w:left="720" w:hanging="360"/>
+      </w:pPr>
+      <w:rPr>
+        <w:rFonts w:ascii="Times New Roman" w:hAnsi="Times New Roman" w:hint="default" w:eastAsia="Times New Roman" w:cs="Times New Roman"/>
+      </w:rPr>
+    </w:lvl>
+    <w:lvl w:ilvl="1" w:tplc="04090003" w:tentative="1">
+      <w:start w:val="1"/>
+      <w:numFmt w:val="bullet"/>
+      <w:lvlText w:val="o"/>
+      <w:lvlJc w:val="left"/>
+      <w:pPr>
+        <w:ind w:left="1440" w:hanging="360"/>
+      </w:pPr>
+      <w:rPr>
+        <w:rFonts w:ascii="Times New Roman" w:hAnsi="Times New Roman" w:cs="Times New Roman" w:hint="default" w:eastAsia="Times New Roman"/>
+      </w:rPr>
+    </w:lvl>
+    <w:lvl w:ilvl="2" w:tplc="04090005" w:tentative="1">
+      <w:start w:val="1"/>
+      <w:numFmt w:val="bullet"/>
+      <w:lvlText w:val=""/>
+      <w:lvlJc w:val="left"/>
+      <w:pPr>
+        <w:ind w:left="2160" w:hanging="360"/>
+      </w:pPr>
+      <w:rPr>
+        <w:rFonts w:ascii="Times New Roman" w:hAnsi="Times New Roman" w:hint="default" w:eastAsia="Times New Roman" w:cs="Times New Roman"/>
+      </w:rPr>
+    </w:lvl>
+    <w:lvl w:ilvl="3" w:tplc="04090001" w:tentative="1">
+      <w:start w:val="1"/>
+      <w:numFmt w:val="bullet"/>
+      <w:lvlText w:val=""/>
+      <w:lvlJc w:val="left"/>
+      <w:pPr>
+        <w:ind w:left="2880" w:hanging="360"/>
+      </w:pPr>
+      <w:rPr>
+        <w:rFonts w:ascii="Times New Roman" w:hAnsi="Times New Roman" w:hint="default" w:eastAsia="Times New Roman" w:cs="Times New Roman"/>
+      </w:rPr>
+    </w:lvl>
+    <w:lvl w:ilvl="4" w:tplc="04090003" w:tentative="1">
+      <w:start w:val="1"/>
+      <w:numFmt w:val="bullet"/>
+      <w:lvlText w:val="o"/>
+      <w:lvlJc w:val="left"/>
+      <w:pPr>
+        <w:ind w:left="3600" w:hanging="360"/>
+      </w:pPr>
+      <w:rPr>
+        <w:rFonts w:ascii="Times New Roman" w:hAnsi="Times New Roman" w:cs="Times New Roman" w:hint="default" w:eastAsia="Times New Roman"/>
+      </w:rPr>
+    </w:lvl>
+    <w:lvl w:ilvl="5" w:tplc="04090005" w:tentative="1">
+      <w:start w:val="1"/>
+      <w:numFmt w:val="bullet"/>
+      <w:lvlText w:val=""/>
+      <w:lvlJc w:val="left"/>
+      <w:pPr>
+        <w:ind w:left="4320" w:hanging="360"/>
+      </w:pPr>
+      <w:rPr>
+        <w:rFonts w:ascii="Times New Roman" w:hAnsi="Times New Roman" w:hint="default" w:eastAsia="Times New Roman" w:cs="Times New Roman"/>
+      </w:rPr>
+    </w:lvl>
+    <w:lvl w:ilvl="6" w:tplc="04090001" w:tentative="1">
+      <w:start w:val="1"/>
+      <w:numFmt w:val="bullet"/>
+      <w:lvlText w:val=""/>
+      <w:lvlJc w:val="left"/>
+      <w:pPr>
+        <w:ind w:left="5040" w:hanging="360"/>
+      </w:pPr>
+      <w:rPr>
+        <w:rFonts w:ascii="Times New Roman" w:hAnsi="Times New Roman" w:hint="default" w:eastAsia="Times New Roman" w:cs="Times New Roman"/>
+      </w:rPr>
+    </w:lvl>
+    <w:lvl w:ilvl="7" w:tplc="04090003" w:tentative="1">
+      <w:start w:val="1"/>
+      <w:numFmt w:val="bullet"/>
+      <w:lvlText w:val="o"/>
+      <w:lvlJc w:val="left"/>
+      <w:pPr>
+        <w:ind w:left="5760" w:hanging="360"/>
+      </w:pPr>
+      <w:rPr>
+        <w:rFonts w:ascii="Times New Roman" w:hAnsi="Times New Roman" w:cs="Times New Roman" w:hint="default" w:eastAsia="Times New Roman"/>
+      </w:rPr>
+    </w:lvl>
+    <w:lvl w:ilvl="8" w:tplc="04090005" w:tentative="1">
+      <w:start w:val="1"/>
+      <w:numFmt w:val="bullet"/>
+      <w:lvlText w:val=""/>
+      <w:lvlJc w:val="left"/>
+      <w:pPr>
+        <w:ind w:left="6480" w:hanging="360"/>
+      </w:pPr>
+      <w:rPr>
+        <w:rFonts w:ascii="Times New Roman" w:hAnsi="Times New Roman" w:hint="default" w:eastAsia="Times New Roman" w:cs="Times New Roman"/>
+      </w:rPr>
+    </w:lvl>
+  </w:abstractNum>
+  <w:abstractNum w:abstractNumId="2" w15:restartNumberingAfterBreak="0">
+    <w:nsid w:val="4E7B1A20"/>
+    <w:multiLevelType w:val="hybridMultilevel"/>
+    <w:tmpl w:val="FC8296EC"/>
+    <w:lvl w:ilvl="0" w:tplc="0409000F">
+      <w:start w:val="1"/>
+      <w:numFmt w:val="decimal"/>
+      <w:lvlText w:val="%1."/>
+      <w:lvlJc w:val="left"/>
+      <w:pPr>
+        <w:ind w:left="720" w:hanging="360"/>
+      </w:pPr>
+      <w:rPr>
+        <w:rFonts w:hint="default" w:ascii="Times New Roman" w:hAnsi="Times New Roman" w:eastAsia="Times New Roman" w:cs="Times New Roman"/>
+      </w:rPr>
+    </w:lvl>
+    <w:lvl w:ilvl="1" w:tplc="04090019" w:tentative="1">
+      <w:start w:val="1"/>
+      <w:numFmt w:val="lowerLetter"/>
+      <w:lvlText w:val="%2."/>
+      <w:lvlJc w:val="left"/>
+      <w:pPr>
+        <w:ind w:left="1440" w:hanging="360"/>
+      </w:pPr>
+    </w:lvl>
+    <w:lvl w:ilvl="2" w:tplc="0409001B" w:tentative="1">
+      <w:start w:val="1"/>
+      <w:numFmt w:val="lowerRoman"/>
+      <w:lvlText w:val="%3."/>
+      <w:lvlJc w:val="right"/>
+      <w:pPr>
+        <w:ind w:left="2160" w:hanging="180"/>
+      </w:pPr>
+    </w:lvl>
+    <w:lvl w:ilvl="3" w:tplc="0409000F" w:tentative="1">
+      <w:start w:val="1"/>
+      <w:numFmt w:val="decimal"/>
+      <w:lvlText w:val="%4."/>
+      <w:lvlJc w:val="left"/>
+      <w:pPr>
+        <w:ind w:left="2880" w:hanging="360"/>
+      </w:pPr>
+    </w:lvl>
+    <w:lvl w:ilvl="4" w:tplc="04090019" w:tentative="1">
+      <w:start w:val="1"/>
+      <w:numFmt w:val="lowerLetter"/>
+      <w:lvlText w:val="%5."/>
+      <w:lvlJc w:val="left"/>
+      <w:pPr>
+        <w:ind w:left="3600" w:hanging="360"/>
+      </w:pPr>
+    </w:lvl>
+    <w:lvl w:ilvl="5" w:tplc="0409001B" w:tentative="1">
+      <w:start w:val="1"/>
+      <w:numFmt w:val="lowerRoman"/>
+      <w:lvlText w:val="%6."/>
+      <w:lvlJc w:val="right"/>
+      <w:pPr>
+        <w:ind w:left="4320" w:hanging="180"/>
+      </w:pPr>
+    </w:lvl>
+    <w:lvl w:ilvl="6" w:tplc="0409000F" w:tentative="1">
+      <w:start w:val="1"/>
+      <w:numFmt w:val="decimal"/>
+      <w:lvlText w:val="%7."/>
+      <w:lvlJc w:val="left"/>
+      <w:pPr>
+        <w:ind w:left="5040" w:hanging="360"/>
+      </w:pPr>
+    </w:lvl>
+    <w:lvl w:ilvl="7" w:tplc="04090019" w:tentative="1">
+      <w:start w:val="1"/>
+      <w:numFmt w:val="lowerLetter"/>
+      <w:lvlText w:val="%8."/>
+      <w:lvlJc w:val="left"/>
+      <w:pPr>
+        <w:ind w:left="5760" w:hanging="360"/>
+      </w:pPr>
+    </w:lvl>
+    <w:lvl w:ilvl="8" w:tplc="0409001B" w:tentative="1">
+      <w:start w:val="1"/>
+      <w:numFmt w:val="lowerRoman"/>
+      <w:lvlText w:val="%9."/>
+      <w:lvlJc w:val="right"/>
+      <w:pPr>
+        <w:ind w:left="6480" w:hanging="180"/>
+      </w:pPr>
+    </w:lvl>
+  </w:abstractNum>
+  <w:abstractNum w:abstractNumId="3" w15:restartNumberingAfterBreak="0">
+    <w:nsid w:val="6AC26C32"/>
+    <w:multiLevelType w:val="hybridMultilevel"/>
+    <w:tmpl w:val="C1625F44"/>
+    <w:lvl w:ilvl="0" w:tplc="0409000F">
+      <w:start w:val="1"/>
+      <w:numFmt w:val="decimal"/>
+      <w:lvlText w:val="%1."/>
+      <w:lvlJc w:val="left"/>
+      <w:pPr>
+        <w:ind w:left="720" w:hanging="360"/>
+      </w:pPr>
+      <w:rPr>
+        <w:rFonts w:hint="default" w:ascii="Times New Roman" w:hAnsi="Times New Roman" w:eastAsia="Times New Roman" w:cs="Times New Roman"/>
+      </w:rPr>
+    </w:lvl>
+    <w:lvl w:ilvl="1" w:tplc="04090019" w:tentative="1">
+      <w:start w:val="1"/>
+      <w:numFmt w:val="lowerLetter"/>
+      <w:lvlText w:val="%2."/>
+      <w:lvlJc w:val="left"/>
+      <w:pPr>
+        <w:ind w:left="1440" w:hanging="360"/>
+      </w:pPr>
+    </w:lvl>
+    <w:lvl w:ilvl="2" w:tplc="0409001B" w:tentative="1">
+      <w:start w:val="1"/>
+      <w:numFmt w:val="lowerRoman"/>
+      <w:lvlText w:val="%3."/>
+      <w:lvlJc w:val="right"/>
+      <w:pPr>
+        <w:ind w:left="2160" w:hanging="180"/>
+      </w:pPr>
+    </w:lvl>
+    <w:lvl w:ilvl="3" w:tplc="0409000F" w:tentative="1">
+      <w:start w:val="1"/>
+      <w:numFmt w:val="decimal"/>
+      <w:lvlText w:val="%4."/>
+      <w:lvlJc w:val="left"/>
+      <w:pPr>
+        <w:ind w:left="2880" w:hanging="360"/>
+      </w:pPr>
+    </w:lvl>
+    <w:lvl w:ilvl="4" w:tplc="04090019" w:tentative="1">
+      <w:start w:val="1"/>
+      <w:numFmt w:val="lowerLetter"/>
+      <w:lvlText w:val="%5."/>
+      <w:lvlJc w:val="left"/>
+      <w:pPr>
+        <w:ind w:left="3600" w:hanging="360"/>
+      </w:pPr>
+    </w:lvl>
+    <w:lvl w:ilvl="5" w:tplc="0409001B" w:tentative="1">
+      <w:start w:val="1"/>
+      <w:numFmt w:val="lowerRoman"/>
+      <w:lvlText w:val="%6."/>
+      <w:lvlJc w:val="right"/>
+      <w:pPr>
+        <w:ind w:left="4320" w:hanging="180"/>
+      </w:pPr>
+    </w:lvl>
+    <w:lvl w:ilvl="6" w:tplc="0409000F" w:tentative="1">
+      <w:start w:val="1"/>
+      <w:numFmt w:val="decimal"/>
+      <w:lvlText w:val="%7."/>
+      <w:lvlJc w:val="left"/>
+      <w:pPr>
+        <w:ind w:left="5040" w:hanging="360"/>
+      </w:pPr>
+    </w:lvl>
+    <w:lvl w:ilvl="7" w:tplc="04090019" w:tentative="1">
+      <w:start w:val="1"/>
+      <w:numFmt w:val="lowerLetter"/>
+      <w:lvlText w:val="%8."/>
+      <w:lvlJc w:val="left"/>
+      <w:pPr>
+        <w:ind w:left="5760" w:hanging="360"/>
+      </w:pPr>
+    </w:lvl>
+    <w:lvl w:ilvl="8" w:tplc="0409001B" w:tentative="1">
+      <w:start w:val="1"/>
+      <w:numFmt w:val="lowerRoman"/>
+      <w:lvlText w:val="%9."/>
+      <w:lvlJc w:val="right"/>
+      <w:pPr>
+        <w:ind w:left="6480" w:hanging="180"/>
+      </w:pPr>
+    </w:lvl>
+  </w:abstractNum>
+  <w:abstractNum w:abstractNumId="4" w15:restartNumberingAfterBreak="0">
+    <w:nsid w:val="724A44B0"/>
+    <w:multiLevelType w:val="hybridMultilevel"/>
+    <w:tmpl w:val="64384A84"/>
+    <w:lvl w:ilvl="0" w:tplc="0409000F">
+      <w:start w:val="1"/>
+      <w:numFmt w:val="decimal"/>
+      <w:lvlText w:val="%1."/>
+      <w:lvlJc w:val="left"/>
+      <w:pPr>
+        <w:ind w:left="720" w:hanging="360"/>
+      </w:pPr>
+      <w:rPr>
+        <w:rFonts w:hint="default" w:ascii="Times New Roman" w:hAnsi="Times New Roman" w:eastAsia="Times New Roman" w:cs="Times New Roman"/>
+      </w:rPr>
+    </w:lvl>
+    <w:lvl w:ilvl="1" w:tplc="04090019" w:tentative="1">
+      <w:start w:val="1"/>
+      <w:numFmt w:val="lowerLetter"/>
+      <w:lvlText w:val="%2."/>
+      <w:lvlJc w:val="left"/>
+      <w:pPr>
+        <w:ind w:left="1440" w:hanging="360"/>
+      </w:pPr>
+    </w:lvl>
+    <w:lvl w:ilvl="2" w:tplc="0409001B" w:tentative="1">
+      <w:start w:val="1"/>
+      <w:numFmt w:val="lowerRoman"/>
+      <w:lvlText w:val="%3."/>
+      <w:lvlJc w:val="right"/>
+      <w:pPr>
+        <w:ind w:left="2160" w:hanging="180"/>
+      </w:pPr>
+    </w:lvl>
+    <w:lvl w:ilvl="3" w:tplc="0409000F" w:tentative="1">
+      <w:start w:val="1"/>
+      <w:numFmt w:val="decimal"/>
+      <w:lvlText w:val="%4."/>
+      <w:lvlJc w:val="left"/>
+      <w:pPr>
+        <w:ind w:left="2880" w:hanging="360"/>
+      </w:pPr>
+    </w:lvl>
+    <w:lvl w:ilvl="4" w:tplc="04090019" w:tentative="1">
+      <w:start w:val="1"/>
+      <w:numFmt w:val="lowerLetter"/>
+      <w:lvlText w:val="%5."/>
+      <w:lvlJc w:val="left"/>
+      <w:pPr>
+        <w:ind w:left="3600" w:hanging="360"/>
+      </w:pPr>
+    </w:lvl>
+    <w:lvl w:ilvl="5" w:tplc="0409001B" w:tentative="1">
+      <w:start w:val="1"/>
+      <w:numFmt w:val="lowerRoman"/>
+      <w:lvlText w:val="%6."/>
+      <w:lvlJc w:val="right"/>
+      <w:pPr>
+        <w:ind w:left="4320" w:hanging="180"/>
+      </w:pPr>
+    </w:lvl>
+    <w:lvl w:ilvl="6" w:tplc="0409000F" w:tentative="1">
+      <w:start w:val="1"/>
+      <w:numFmt w:val="decimal"/>
+      <w:lvlText w:val="%7."/>
+      <w:lvlJc w:val="left"/>
+      <w:pPr>
+        <w:ind w:left="5040" w:hanging="360"/>
+      </w:pPr>
+    </w:lvl>
+    <w:lvl w:ilvl="7" w:tplc="04090019" w:tentative="1">
+      <w:start w:val="1"/>
+      <w:numFmt w:val="lowerLetter"/>
+      <w:lvlText w:val="%8."/>
+      <w:lvlJc w:val="left"/>
+      <w:pPr>
+        <w:ind w:left="5760" w:hanging="360"/>
+      </w:pPr>
+    </w:lvl>
+    <w:lvl w:ilvl="8" w:tplc="0409001B" w:tentative="1">
+      <w:start w:val="1"/>
+      <w:numFmt w:val="lowerRoman"/>
+      <w:lvlText w:val="%9."/>
+      <w:lvlJc w:val="right"/>
+      <w:pPr>
+        <w:ind w:left="6480" w:hanging="180"/>
+      </w:pPr>
+    </w:lvl>
+  </w:abstractNum>
+  <w:abstractNum w:abstractNumId="5" w15:restartNumberingAfterBreak="0">
+    <w:nsid w:val="72E62936"/>
+    <w:multiLevelType w:val="hybridMultilevel"/>
+    <w:tmpl w:val="1C183240"/>
+    <w:lvl w:ilvl="0" w:tplc="72EA1F60">
+      <w:start w:val="1"/>
+      <w:numFmt w:val="decimal"/>
+      <w:lvlText w:val="%1."/>
+      <w:lvlJc w:val="left"/>
+      <w:pPr>
+        <w:ind w:left="502" w:hanging="360"/>
+      </w:pPr>
+      <w:rPr>
+        <w:rFonts w:hint="default" w:ascii="Times New Roman" w:hAnsi="Times New Roman" w:eastAsia="Times New Roman" w:cs="Times New Roman"/>
+      </w:rPr>
+    </w:lvl>
+    <w:lvl w:ilvl="1" w:tplc="04090019" w:tentative="1">
+      <w:start w:val="1"/>
+      <w:numFmt w:val="lowerLetter"/>
+      <w:lvlText w:val="%2."/>
+      <w:lvlJc w:val="left"/>
+      <w:pPr>
+        <w:ind w:left="1222" w:hanging="360"/>
+      </w:pPr>
+    </w:lvl>
+    <w:lvl w:ilvl="2" w:tplc="0409001B" w:tentative="1">
+      <w:start w:val="1"/>
+      <w:numFmt w:val="lowerRoman"/>
+      <w:lvlText w:val="%3."/>
+      <w:lvlJc w:val="right"/>
+      <w:pPr>
+        <w:ind w:left="1942" w:hanging="180"/>
+      </w:pPr>
+    </w:lvl>
+    <w:lvl w:ilvl="3" w:tplc="0409000F" w:tentative="1">
+      <w:start w:val="1"/>
+      <w:numFmt w:val="decimal"/>
+      <w:lvlText w:val="%4."/>
+      <w:lvlJc w:val="left"/>
+      <w:pPr>
+        <w:ind w:left="2662" w:hanging="360"/>
+      </w:pPr>
+    </w:lvl>
+    <w:lvl w:ilvl="4" w:tplc="04090019" w:tentative="1">
+      <w:start w:val="1"/>
+      <w:numFmt w:val="lowerLetter"/>
+      <w:lvlText w:val="%5."/>
+      <w:lvlJc w:val="left"/>
+      <w:pPr>
+        <w:ind w:left="3382" w:hanging="360"/>
+      </w:pPr>
+    </w:lvl>
+    <w:lvl w:ilvl="5" w:tplc="0409001B" w:tentative="1">
+      <w:start w:val="1"/>
+      <w:numFmt w:val="lowerRoman"/>
+      <w:lvlText w:val="%6."/>
+      <w:lvlJc w:val="right"/>
+      <w:pPr>
+        <w:ind w:left="4102" w:hanging="180"/>
+      </w:pPr>
+    </w:lvl>
+    <w:lvl w:ilvl="6" w:tplc="0409000F" w:tentative="1">
+      <w:start w:val="1"/>
+      <w:numFmt w:val="decimal"/>
+      <w:lvlText w:val="%7."/>
+      <w:lvlJc w:val="left"/>
+      <w:pPr>
+        <w:ind w:left="4822" w:hanging="360"/>
+      </w:pPr>
+    </w:lvl>
+    <w:lvl w:ilvl="7" w:tplc="04090019" w:tentative="1">
+      <w:start w:val="1"/>
+      <w:numFmt w:val="lowerLetter"/>
+      <w:lvlText w:val="%8."/>
+      <w:lvlJc w:val="left"/>
+      <w:pPr>
+        <w:ind w:left="5542" w:hanging="360"/>
+      </w:pPr>
+    </w:lvl>
+    <w:lvl w:ilvl="8" w:tplc="0409001B" w:tentative="1">
+      <w:start w:val="1"/>
+      <w:numFmt w:val="lowerRoman"/>
+      <w:lvlText w:val="%9."/>
+      <w:lvlJc w:val="right"/>
+      <w:pPr>
+        <w:ind w:left="6262" w:hanging="180"/>
+      </w:pPr>
+    </w:lvl>
+  </w:abstractNum>
+  <w:abstractNum w:abstractNumId="6" w15:restartNumberingAfterBreak="0">
+    <w:nsid w:val="77890FFB"/>
+    <w:multiLevelType w:val="hybridMultilevel"/>
+    <w:tmpl w:val="A34E6B86"/>
+    <w:lvl w:ilvl="0" w:tplc="42F4FA7A">
+      <w:start w:val="1"/>
+      <w:numFmt w:val="upperRoman"/>
+      <w:lvlText w:val="%1."/>
+      <w:lvlJc w:val="left"/>
+      <w:pPr>
+        <w:ind w:left="1080" w:hanging="720"/>
+      </w:pPr>
+      <w:rPr>
+        <w:rFonts w:hint="default" w:ascii="Times New Roman" w:hAnsi="Times New Roman" w:eastAsia="Times New Roman" w:cs="Times New Roman"/>
+      </w:rPr>
+    </w:lvl>
+    <w:lvl w:ilvl="1" w:tplc="04090019" w:tentative="1">
+      <w:start w:val="1"/>
+      <w:numFmt w:val="lowerLetter"/>
+      <w:lvlText w:val="%2."/>
+      <w:lvlJc w:val="left"/>
+      <w:pPr>
+        <w:ind w:left="1440" w:hanging="360"/>
+      </w:pPr>
+    </w:lvl>
+    <w:lvl w:ilvl="2" w:tplc="0409001B" w:tentative="1">
+      <w:start w:val="1"/>
+      <w:numFmt w:val="lowerRoman"/>
+      <w:lvlText w:val="%3."/>
+      <w:lvlJc w:val="right"/>
+      <w:pPr>
+        <w:ind w:left="2160" w:hanging="180"/>
+      </w:pPr>
+    </w:lvl>
+    <w:lvl w:ilvl="3" w:tplc="0409000F" w:tentative="1">
+      <w:start w:val="1"/>
+      <w:numFmt w:val="decimal"/>
+      <w:lvlText w:val="%4."/>
+      <w:lvlJc w:val="left"/>
+      <w:pPr>
+        <w:ind w:left="2880" w:hanging="360"/>
+      </w:pPr>
+    </w:lvl>
+    <w:lvl w:ilvl="4" w:tplc="04090019" w:tentative="1">
+      <w:start w:val="1"/>
+      <w:numFmt w:val="lowerLetter"/>
+      <w:lvlText w:val="%5."/>
+      <w:lvlJc w:val="left"/>
+      <w:pPr>
+        <w:ind w:left="3600" w:hanging="360"/>
+      </w:pPr>
+    </w:lvl>
+    <w:lvl w:ilvl="5" w:tplc="0409001B" w:tentative="1">
+      <w:start w:val="1"/>
+      <w:numFmt w:val="lowerRoman"/>
+      <w:lvlText w:val="%6."/>
+      <w:lvlJc w:val="right"/>
+      <w:pPr>
+        <w:ind w:left="4320" w:hanging="180"/>
+      </w:pPr>
+    </w:lvl>
+    <w:lvl w:ilvl="6" w:tplc="0409000F" w:tentative="1">
+      <w:start w:val="1"/>
+      <w:numFmt w:val="decimal"/>
+      <w:lvlText w:val="%7."/>
+      <w:lvlJc w:val="left"/>
+      <w:pPr>
+        <w:ind w:left="5040" w:hanging="360"/>
+      </w:pPr>
+    </w:lvl>
+    <w:lvl w:ilvl="7" w:tplc="04090019" w:tentative="1">
+      <w:start w:val="1"/>
+      <w:numFmt w:val="lowerLetter"/>
+      <w:lvlText w:val="%8."/>
+      <w:lvlJc w:val="left"/>
+      <w:pPr>
+        <w:ind w:left="5760" w:hanging="360"/>
+      </w:pPr>
+    </w:lvl>
+    <w:lvl w:ilvl="8" w:tplc="0409001B" w:tentative="1">
+      <w:start w:val="1"/>
+      <w:numFmt w:val="lowerRoman"/>
+      <w:lvlText w:val="%9."/>
+      <w:lvlJc w:val="right"/>
+      <w:pPr>
+        <w:ind w:left="6480" w:hanging="180"/>
+      </w:pPr>
+    </w:lvl>
+  </w:abstractNum>
+  <w:num w:numId="1" w16cid:durableId="321469849">
+    <w:abstractNumId w:val="6"/>
+  </w:num>
+  <w:num w:numId="2" w16cid:durableId="315454563">
+    <w:abstractNumId w:val="5"/>
+  </w:num>
+  <w:num w:numId="3" w16cid:durableId="581135923">
+    <w:abstractNumId w:val="1"/>
+  </w:num>
+  <w:num w:numId="4" w16cid:durableId="1372799819">
+    <w:abstractNumId w:val="0"/>
+  </w:num>
+  <w:num w:numId="5" w16cid:durableId="1259950476">
+    <w:abstractNumId w:val="4"/>
+  </w:num>
+  <w:num w:numId="6" w16cid:durableId="760105485">
+    <w:abstractNumId w:val="3"/>
+  </w:num>
+  <w:num w:numId="7" w16cid:durableId="2072532188">
+    <w:abstractNumId w:val="2"/>
+  </w:num>
+</w:numbering>
 </file>
 
 <file path=word/styles.xml><?xml version="1.0" encoding="utf-8"?>
@@ -3965,6 +5471,58 @@
       <w:szCs w:val="20"/>
     </w:rPr>
   </w:style>
+  <w:style w:type="paragraph" w:styleId="LeaseNormal">
+    <w:name w:val="Lease Normal"/>
+    <w:qFormat/>
+    <w:rsid w:val="00334194"/>
+    <w:pPr>
+      <w:spacing w:after="160" w:line="259" w:lineRule="auto"/>
+    </w:pPr>
+    <w:rPr>
+      <w:rFonts w:ascii="Times New Roman" w:hAnsi="Times New Roman" w:eastAsia="Times New Roman" w:cs="Times New Roman"/>
+      <w:sz w:val="22"/>
+      <w:szCs w:val="22"/>
+      <w:lang w:val="en-US" w:eastAsia="en-US" w:bidi="ar-SA"/>
+    </w:rPr>
+  </w:style>
+  <w:style w:type="character" w:styleId="LeaseDefaultParagraphFont">
+    <w:name w:val="Lease Default Paragraph Font"/>
+    <w:uiPriority w:val="1"/>
+    <w:semiHidden/>
+    <w:unhideWhenUsed/>
+  </w:style>
+  <w:style w:type="table" w:styleId="LeaseTableNormal">
+    <w:name w:val="Lease Normal Table"/>
+    <w:uiPriority w:val="99"/>
+    <w:semiHidden/>
+    <w:unhideWhenUsed/>
+    <w:tblPr>
+      <w:tblInd w:w="0" w:type="dxa"/>
+      <w:tblCellMar>
+        <w:top w:w="0" w:type="dxa"/>
+        <w:left w:w="108" w:type="dxa"/>
+        <w:bottom w:w="0" w:type="dxa"/>
+        <w:right w:w="108" w:type="dxa"/>
+      </w:tblCellMar>
+    </w:tblPr>
+  </w:style>
+  <w:style w:type="numbering" w:styleId="LeaseNoList">
+    <w:name w:val="Lease No List"/>
+    <w:uiPriority w:val="99"/>
+    <w:semiHidden/>
+    <w:unhideWhenUsed/>
+  </w:style>
+  <w:style w:type="paragraph" w:styleId="LeaseListParagraph">
+    <w:name w:val="Lease List Paragraph"/>
+    <w:basedOn w:val="LeaseNormal"/>
+    <w:uiPriority w:val="34"/>
+    <w:qFormat/>
+    <w:rsid w:val="00334194"/>
+    <w:pPr>
+      <w:ind w:left="720"/>
+      <w:contextualSpacing/>
+    </w:pPr>
+  </w:style>
 </w:styles>
 </file>
 
@@ -4429,7 +5987,7 @@
 </file>
 
 <file path=customXml/itemProps4.xml><?xml version="1.0" encoding="utf-8"?>
-<ds:datastoreItem xmlns:ds="http://schemas.openxmlformats.org/officeDocument/2006/customXml" ds:itemID="{6AE062B6-9CFE-4779-96D2-94286D92DD48}">
+<ds:datastoreItem xmlns:ds="http://schemas.openxmlformats.org/officeDocument/2006/customXml" ds:itemID="{62833CF4-2D3C-41D2-8ADD-66A70041561F}">
   <ds:schemaRefs>
     <ds:schemaRef ds:uri="http://schemas.microsoft.com/office/2006/metadata/properties"/>
     <ds:schemaRef ds:uri="http://schemas.microsoft.com/office/infopath/2007/PartnerControls"/>

</xml_diff>

<commit_message>
fix(ct01): giữ ngày ký trên một dòng
Bỏ ngắt dòng trước chữ năm và giảm riêng bốn đoạn ngày phía trên ô ký tên
CT01 xuống 10pt. Sinh lại mẫu Word, giữ nguyên nội dung và định dạng khác.
Hồi quy kiểm đủ bốn ngày, cỡ chữ và nhãn ký tên so với mẫu nguồn.

Kiểm chứng: 13 unit test, 7 E2E tải Word, typecheck không có fingerprint,
lint, 42 gate trước push, build và bundle đều đạt. Word 16 render hai trang;
cả bốn ngày có một dòng, cỡ 10. Review XML xác nhận chỉ bốn đoạn ngày đổi.

Co-Authored-By: Codex <noreply@openai.com>
</commit_message>
<xml_diff>
--- a/public/templates/ct01.docx
+++ b/public/templates/ct01.docx
@@ -2986,15 +2986,16 @@
               <w:rPr>
                 <w:rFonts w:ascii="Times New Roman" w:eastAsia="Times New Roman" w:hAnsi="Times New Roman"/>
                 <w:i/>
-                <w:szCs w:val="28"/>
-                <w:lang w:val="pt-BR"/>
-              </w:rPr>
-            </w:pPr>
-            <w:r>
-              <w:rPr>
-                <w:rFonts w:ascii="Times New Roman" w:eastAsia="Times New Roman" w:hAnsi="Times New Roman"/>
-                <w:sz w:val="24"/>
-                <w:szCs w:val="28"/>
+                <w:sz w:val="20"/>
+                <w:szCs w:val="20"/>
+                <w:lang w:val="pt-BR"/>
+              </w:rPr>
+            </w:pPr>
+            <w:r>
+              <w:rPr>
+                <w:rFonts w:ascii="Times New Roman" w:eastAsia="Times New Roman" w:hAnsi="Times New Roman"/>
+                <w:sz w:val="20"/>
+                <w:szCs w:val="20"/>
                 <w:lang w:val="pt-BR"/>
               </w:rPr>
               <w:t xml:space="preserve"/>
@@ -3003,7 +3004,8 @@
               <w:rPr>
                 <w:rFonts w:ascii="Times New Roman" w:eastAsia="Times New Roman" w:hAnsi="Times New Roman"/>
                 <w:i/>
-                <w:szCs w:val="28"/>
+                <w:sz w:val="20"/>
+                <w:szCs w:val="20"/>
                 <w:lang w:val="pt-BR"/>
               </w:rPr>
               <w:t xml:space="preserve"/>
@@ -3012,7 +3014,8 @@
               <w:rPr>
                 <w:rFonts w:ascii="Times New Roman" w:eastAsia="Times New Roman" w:hAnsi="Times New Roman"/>
                 <w:i/>
-                <w:szCs w:val="26"/>
+                <w:sz w:val="20"/>
+                <w:szCs w:val="20"/>
                 <w:lang w:val="pt-BR"/>
               </w:rPr>
               <w:t>ngày</w:t>
@@ -3020,8 +3023,8 @@
             <w:r>
               <w:rPr>
                 <w:rFonts w:ascii="Times New Roman" w:eastAsia="Times New Roman" w:hAnsi="Times New Roman"/>
-                <w:sz w:val="24"/>
-                <w:szCs w:val="28"/>
+                <w:sz w:val="20"/>
+                <w:szCs w:val="20"/>
                 <w:lang w:val="pt-BR"/>
               </w:rPr>
               <w:t xml:space="preserve"> {signature_day} </w:t>
@@ -3030,7 +3033,8 @@
               <w:rPr>
                 <w:rFonts w:ascii="Times New Roman" w:eastAsia="Times New Roman" w:hAnsi="Times New Roman"/>
                 <w:i/>
-                <w:szCs w:val="28"/>
+                <w:sz w:val="20"/>
+                <w:szCs w:val="20"/>
                 <w:lang w:val="pt-BR"/>
               </w:rPr>
               <w:t xml:space="preserve"/>
@@ -3039,7 +3043,8 @@
               <w:rPr>
                 <w:rFonts w:ascii="Times New Roman" w:eastAsia="Times New Roman" w:hAnsi="Times New Roman"/>
                 <w:i/>
-                <w:szCs w:val="26"/>
+                <w:sz w:val="20"/>
+                <w:szCs w:val="20"/>
                 <w:lang w:val="pt-BR"/>
               </w:rPr>
               <w:t>tháng</w:t>
@@ -3048,7 +3053,8 @@
               <w:rPr>
                 <w:rFonts w:ascii="Times New Roman" w:eastAsia="Times New Roman" w:hAnsi="Times New Roman"/>
                 <w:i/>
-                <w:szCs w:val="28"/>
+                <w:sz w:val="20"/>
+                <w:szCs w:val="20"/>
                 <w:lang w:val="pt-BR"/>
               </w:rPr>
               <w:t xml:space="preserve"> {signature_month} </w:t>
@@ -3057,18 +3063,17 @@
               <w:rPr>
                 <w:rFonts w:ascii="Times New Roman" w:eastAsia="Times New Roman" w:hAnsi="Times New Roman"/>
                 <w:i/>
-                <w:szCs w:val="26"/>
-                <w:lang w:val="pt-BR"/>
-              </w:rPr>
-              <w:t/>
-              <w:br/>
-              <w:t xml:space="preserve">năm</w:t>
-            </w:r>
-            <w:r>
-              <w:rPr>
-                <w:rFonts w:ascii="Times New Roman" w:eastAsia="Times New Roman" w:hAnsi="Times New Roman"/>
-                <w:sz w:val="24"/>
-                <w:szCs w:val="28"/>
+                <w:sz w:val="20"/>
+                <w:szCs w:val="20"/>
+                <w:lang w:val="pt-BR"/>
+              </w:rPr>
+              <w:t>năm</w:t>
+            </w:r>
+            <w:r>
+              <w:rPr>
+                <w:rFonts w:ascii="Times New Roman" w:eastAsia="Times New Roman" w:hAnsi="Times New Roman"/>
+                <w:sz w:val="20"/>
+                <w:szCs w:val="20"/>
                 <w:lang w:val="pt-BR"/>
               </w:rPr>
               <w:t xml:space="preserve"> {signature_year} </w:t>
@@ -3077,7 +3082,8 @@
               <w:rPr>
                 <w:rFonts w:ascii="Times New Roman" w:eastAsia="Times New Roman" w:hAnsi="Times New Roman"/>
                 <w:i/>
-                <w:szCs w:val="28"/>
+                <w:sz w:val="20"/>
+                <w:szCs w:val="20"/>
                 <w:lang w:val="pt-BR"/>
               </w:rPr>
               <w:t xml:space="preserve"/>
@@ -3131,15 +3137,16 @@
               <w:rPr>
                 <w:rFonts w:ascii="Times New Roman" w:eastAsia="Times New Roman" w:hAnsi="Times New Roman"/>
                 <w:i/>
-                <w:szCs w:val="28"/>
+                <w:sz w:val="20"/>
+                <w:szCs w:val="20"/>
                 <w:lang w:val="vi-VN"/>
               </w:rPr>
             </w:pPr>
             <w:r>
               <w:rPr>
                 <w:rFonts w:ascii="Times New Roman" w:eastAsia="Times New Roman" w:hAnsi="Times New Roman"/>
-                <w:sz w:val="24"/>
-                <w:szCs w:val="28"/>
+                <w:sz w:val="20"/>
+                <w:szCs w:val="20"/>
                 <w:lang w:val="vi-VN"/>
               </w:rPr>
               <w:t xml:space="preserve"/>
@@ -3148,7 +3155,8 @@
               <w:rPr>
                 <w:rFonts w:ascii="Times New Roman" w:eastAsia="Times New Roman" w:hAnsi="Times New Roman"/>
                 <w:i/>
-                <w:szCs w:val="28"/>
+                <w:sz w:val="20"/>
+                <w:szCs w:val="20"/>
                 <w:lang w:val="vi-VN"/>
               </w:rPr>
               <w:t xml:space="preserve"/>
@@ -3157,7 +3165,8 @@
               <w:rPr>
                 <w:rFonts w:ascii="Times New Roman" w:eastAsia="Times New Roman" w:hAnsi="Times New Roman"/>
                 <w:i/>
-                <w:szCs w:val="26"/>
+                <w:sz w:val="20"/>
+                <w:szCs w:val="20"/>
                 <w:lang w:val="vi-VN"/>
               </w:rPr>
               <w:t>ngày</w:t>
@@ -3165,8 +3174,8 @@
             <w:r>
               <w:rPr>
                 <w:rFonts w:ascii="Times New Roman" w:eastAsia="Times New Roman" w:hAnsi="Times New Roman"/>
-                <w:sz w:val="24"/>
-                <w:szCs w:val="28"/>
+                <w:sz w:val="20"/>
+                <w:szCs w:val="20"/>
                 <w:lang w:val="vi-VN"/>
               </w:rPr>
               <w:t xml:space="preserve"> {signature_day} </w:t>
@@ -3175,7 +3184,8 @@
               <w:rPr>
                 <w:rFonts w:ascii="Times New Roman" w:eastAsia="Times New Roman" w:hAnsi="Times New Roman"/>
                 <w:i/>
-                <w:szCs w:val="28"/>
+                <w:sz w:val="20"/>
+                <w:szCs w:val="20"/>
                 <w:lang w:val="vi-VN"/>
               </w:rPr>
               <w:t xml:space="preserve"/>
@@ -3184,7 +3194,8 @@
               <w:rPr>
                 <w:rFonts w:ascii="Times New Roman" w:eastAsia="Times New Roman" w:hAnsi="Times New Roman"/>
                 <w:i/>
-                <w:szCs w:val="26"/>
+                <w:sz w:val="20"/>
+                <w:szCs w:val="20"/>
                 <w:lang w:val="vi-VN"/>
               </w:rPr>
               <w:t>tháng</w:t>
@@ -3193,7 +3204,8 @@
               <w:rPr>
                 <w:rFonts w:ascii="Times New Roman" w:eastAsia="Times New Roman" w:hAnsi="Times New Roman"/>
                 <w:i/>
-                <w:szCs w:val="28"/>
+                <w:sz w:val="20"/>
+                <w:szCs w:val="20"/>
                 <w:lang w:val="vi-VN"/>
               </w:rPr>
               <w:t xml:space="preserve"> {signature_month} </w:t>
@@ -3202,18 +3214,17 @@
               <w:rPr>
                 <w:rFonts w:ascii="Times New Roman" w:eastAsia="Times New Roman" w:hAnsi="Times New Roman"/>
                 <w:i/>
-                <w:szCs w:val="26"/>
+                <w:sz w:val="20"/>
+                <w:szCs w:val="20"/>
                 <w:lang w:val="vi-VN"/>
               </w:rPr>
-              <w:t/>
-              <w:br/>
-              <w:t xml:space="preserve">năm</w:t>
-            </w:r>
-            <w:r>
-              <w:rPr>
-                <w:rFonts w:ascii="Times New Roman" w:eastAsia="Times New Roman" w:hAnsi="Times New Roman"/>
-                <w:sz w:val="24"/>
-                <w:szCs w:val="28"/>
+              <w:t>năm</w:t>
+            </w:r>
+            <w:r>
+              <w:rPr>
+                <w:rFonts w:ascii="Times New Roman" w:eastAsia="Times New Roman" w:hAnsi="Times New Roman"/>
+                <w:sz w:val="20"/>
+                <w:szCs w:val="20"/>
                 <w:lang w:val="vi-VN"/>
               </w:rPr>
               <w:t xml:space="preserve"> {signature_year} </w:t>
@@ -3265,15 +3276,16 @@
               <w:rPr>
                 <w:rFonts w:ascii="Times New Roman" w:eastAsia="Times New Roman" w:hAnsi="Times New Roman"/>
                 <w:i/>
-                <w:szCs w:val="16"/>
+                <w:sz w:val="20"/>
+                <w:szCs w:val="20"/>
                 <w:lang w:val="vi-VN"/>
               </w:rPr>
             </w:pPr>
             <w:r>
               <w:rPr>
                 <w:rFonts w:ascii="Times New Roman" w:eastAsia="Times New Roman" w:hAnsi="Times New Roman"/>
-                <w:sz w:val="24"/>
-                <w:szCs w:val="16"/>
+                <w:sz w:val="20"/>
+                <w:szCs w:val="20"/>
                 <w:lang w:val="vi-VN"/>
               </w:rPr>
               <w:t xml:space="preserve"/>
@@ -3282,7 +3294,8 @@
               <w:rPr>
                 <w:rFonts w:ascii="Times New Roman" w:eastAsia="Times New Roman" w:hAnsi="Times New Roman"/>
                 <w:i/>
-                <w:szCs w:val="16"/>
+                <w:sz w:val="20"/>
+                <w:szCs w:val="20"/>
                 <w:lang w:val="vi-VN"/>
               </w:rPr>
               <w:t xml:space="preserve">ngày</w:t>
@@ -3290,8 +3303,8 @@
             <w:r>
               <w:rPr>
                 <w:rFonts w:ascii="Times New Roman" w:eastAsia="Times New Roman" w:hAnsi="Times New Roman"/>
-                <w:sz w:val="24"/>
-                <w:szCs w:val="16"/>
+                <w:sz w:val="20"/>
+                <w:szCs w:val="20"/>
                 <w:lang w:val="vi-VN"/>
               </w:rPr>
               <w:t xml:space="preserve"> {signature_day} </w:t>
@@ -3300,18 +3313,17 @@
               <w:rPr>
                 <w:rFonts w:ascii="Times New Roman" w:eastAsia="Times New Roman" w:hAnsi="Times New Roman"/>
                 <w:i/>
-                <w:szCs w:val="16"/>
+                <w:sz w:val="20"/>
+                <w:szCs w:val="20"/>
                 <w:lang w:val="vi-VN"/>
               </w:rPr>
-              <w:t xml:space="preserve">tháng {signature_month} </w:t>
-              <w:br/>
-              <w:t xml:space="preserve">năm</w:t>
-            </w:r>
-            <w:r>
-              <w:rPr>
-                <w:rFonts w:ascii="Times New Roman" w:eastAsia="Times New Roman" w:hAnsi="Times New Roman"/>
-                <w:sz w:val="24"/>
-                <w:szCs w:val="16"/>
+              <w:t xml:space="preserve">tháng {signature_month} năm</w:t>
+            </w:r>
+            <w:r>
+              <w:rPr>
+                <w:rFonts w:ascii="Times New Roman" w:eastAsia="Times New Roman" w:hAnsi="Times New Roman"/>
+                <w:sz w:val="20"/>
+                <w:szCs w:val="20"/>
                 <w:lang w:val="vi-VN"/>
               </w:rPr>
               <w:t xml:space="preserve"> {signature_year} </w:t>
@@ -3386,15 +3398,16 @@
               <w:rPr>
                 <w:rFonts w:ascii="Times New Roman" w:eastAsia="Times New Roman" w:hAnsi="Times New Roman"/>
                 <w:i/>
-                <w:szCs w:val="28"/>
+                <w:sz w:val="20"/>
+                <w:szCs w:val="20"/>
                 <w:lang w:val="vi-VN"/>
               </w:rPr>
             </w:pPr>
             <w:r>
               <w:rPr>
                 <w:rFonts w:ascii="Times New Roman" w:eastAsia="Times New Roman" w:hAnsi="Times New Roman"/>
-                <w:sz w:val="24"/>
-                <w:szCs w:val="28"/>
+                <w:sz w:val="20"/>
+                <w:szCs w:val="20"/>
                 <w:lang w:val="vi-VN"/>
               </w:rPr>
               <w:t xml:space="preserve"/>
@@ -3403,7 +3416,8 @@
               <w:rPr>
                 <w:rFonts w:ascii="Times New Roman" w:eastAsia="Times New Roman" w:hAnsi="Times New Roman"/>
                 <w:i/>
-                <w:szCs w:val="28"/>
+                <w:sz w:val="20"/>
+                <w:szCs w:val="20"/>
                 <w:lang w:val="vi-VN"/>
               </w:rPr>
               <w:t xml:space="preserve"/>
@@ -3412,7 +3426,8 @@
               <w:rPr>
                 <w:rFonts w:ascii="Times New Roman" w:eastAsia="Times New Roman" w:hAnsi="Times New Roman"/>
                 <w:i/>
-                <w:szCs w:val="26"/>
+                <w:sz w:val="20"/>
+                <w:szCs w:val="20"/>
                 <w:lang w:val="vi-VN"/>
               </w:rPr>
               <w:t>ngày</w:t>
@@ -3421,7 +3436,8 @@
               <w:rPr>
                 <w:rFonts w:ascii="Times New Roman" w:eastAsia="Times New Roman" w:hAnsi="Times New Roman"/>
                 <w:i/>
-                <w:szCs w:val="28"/>
+                <w:sz w:val="20"/>
+                <w:szCs w:val="20"/>
                 <w:lang w:val="vi-VN"/>
               </w:rPr>
               <w:t xml:space="preserve"> {signature_day} </w:t>
@@ -3430,7 +3446,8 @@
               <w:rPr>
                 <w:rFonts w:ascii="Times New Roman" w:eastAsia="Times New Roman" w:hAnsi="Times New Roman"/>
                 <w:i/>
-                <w:szCs w:val="26"/>
+                <w:sz w:val="20"/>
+                <w:szCs w:val="20"/>
                 <w:lang w:val="vi-VN"/>
               </w:rPr>
               <w:t>tháng</w:t>
@@ -3439,7 +3456,8 @@
               <w:rPr>
                 <w:rFonts w:ascii="Times New Roman" w:eastAsia="Times New Roman" w:hAnsi="Times New Roman"/>
                 <w:i/>
-                <w:szCs w:val="28"/>
+                <w:sz w:val="20"/>
+                <w:szCs w:val="20"/>
                 <w:lang w:val="vi-VN"/>
               </w:rPr>
               <w:t xml:space="preserve"> {signature_month} </w:t>
@@ -3448,18 +3466,17 @@
               <w:rPr>
                 <w:rFonts w:ascii="Times New Roman" w:eastAsia="Times New Roman" w:hAnsi="Times New Roman"/>
                 <w:i/>
-                <w:szCs w:val="26"/>
+                <w:sz w:val="20"/>
+                <w:szCs w:val="20"/>
                 <w:lang w:val="vi-VN"/>
               </w:rPr>
-              <w:t/>
-              <w:br/>
-              <w:t xml:space="preserve">năm</w:t>
-            </w:r>
-            <w:r>
-              <w:rPr>
-                <w:rFonts w:ascii="Times New Roman" w:eastAsia="Times New Roman" w:hAnsi="Times New Roman"/>
-                <w:sz w:val="24"/>
-                <w:szCs w:val="28"/>
+              <w:t>năm</w:t>
+            </w:r>
+            <w:r>
+              <w:rPr>
+                <w:rFonts w:ascii="Times New Roman" w:eastAsia="Times New Roman" w:hAnsi="Times New Roman"/>
+                <w:sz w:val="20"/>
+                <w:szCs w:val="20"/>
                 <w:lang w:val="vi-VN"/>
               </w:rPr>
               <w:t xml:space="preserve"> {signature_year} </w:t>

</xml_diff>

<commit_message>
fix(ct01): cập nhật hợp đồng và dùng địa chỉ chi tiết
Dùng nội dung hợp đồng cho thuê, mượn, ở nhờ theo mẫu mới; giữ nguyên trang
CT01. Địa chỉ tòa trong Word và hộp chọn phòng chỉ lấy street_address, không
nối các trường hành chính. Hợp đồng ghi đầy đủ ngày sinh bên B và thời hạn
từ ngày tải đến ngày tương ứng sau 12 hoặc 24 tháng theo lịch Việt Nam,
clamp ngày 29/2 khi cần. Địa phương ký ưu tiên thành phần có tiền tố rõ
trong địa chỉ chi tiết; cơ quan đăng ký vẫn lấy trường phường riêng.

Kiểm chứng: 28 unit test, 8 E2E tải Word, các ca ngày ở UTC-11 và UTC+14,
typecheck app/E2E, lint, 42 gate trước push, build và bundle đều đạt.
Review độc lập và Word QA xác nhận hai trang, CT01 giữ nguyên.

Co-Authored-By: Codex <noreply@openai.com>
</commit_message>
<xml_diff>
--- a/public/templates/ct01.docx
+++ b/public/templates/ct01.docx
@@ -3543,512 +3543,456 @@
     <w:p>
       <w:pPr>
         <w:pStyle w:val="LeaseNormal"/>
+        <w:spacing w:before="0" w:after="160" w:line="240" w:lineRule="auto"/>
         <w:jc w:val="center"/>
+      </w:pPr>
+      <w:r>
         <w:rPr>
           <w:rFonts w:ascii="Times New Roman" w:hAnsi="Times New Roman" w:eastAsia="Times New Roman" w:cs="Times New Roman"/>
           <w:b/>
-          <w:sz w:val="24"/>
-          <w:szCs w:val="24"/>
-        </w:rPr>
-      </w:pPr>
-      <w:r>
-        <w:rPr>
-          <w:rFonts w:ascii="Times New Roman" w:hAnsi="Times New Roman" w:eastAsia="Times New Roman" w:cs="Times New Roman"/>
-          <w:b/>
-          <w:sz w:val="24"/>
-          <w:szCs w:val="24"/>
-        </w:rPr>
-        <w:t>CỘNG HÒA XÃ HỘI CHỦ NGHĨA VIỆT NAM</w:t>
+          <w:sz w:val="22"/>
+          <w:szCs w:val="22"/>
+        </w:rPr>
+        <w:t xml:space="preserve">CỘNG HÒA XÃ HỘI CHỦ NGHĨA VIỆT NAM</w:t>
       </w:r>
     </w:p>
     <w:p>
       <w:pPr>
         <w:pStyle w:val="LeaseNormal"/>
+        <w:spacing w:before="0" w:after="100" w:line="240" w:lineRule="auto"/>
         <w:jc w:val="center"/>
+      </w:pPr>
+      <w:r>
         <w:rPr>
           <w:rFonts w:ascii="Times New Roman" w:hAnsi="Times New Roman" w:eastAsia="Times New Roman" w:cs="Times New Roman"/>
-          <w:u w:val="single"/>
-        </w:rPr>
-      </w:pPr>
-      <w:r>
-        <w:rPr>
-          <w:rFonts w:ascii="Times New Roman" w:hAnsi="Times New Roman" w:eastAsia="Times New Roman" w:cs="Times New Roman"/>
-          <w:u w:val="single"/>
-        </w:rPr>
-        <w:t>Độc lập – Tự do- Hạnh Phúc</w:t>
+          <w:sz w:val="22"/>
+          <w:szCs w:val="22"/>
+        </w:rPr>
+        <w:t xml:space="preserve">Độc lập - Tự do - Hạnh Phúc</w:t>
       </w:r>
     </w:p>
     <w:p>
       <w:pPr>
         <w:pStyle w:val="LeaseNormal"/>
+        <w:spacing w:before="0" w:after="200" w:line="240" w:lineRule="auto"/>
         <w:jc w:val="center"/>
+      </w:pPr>
+      <w:r>
         <w:rPr>
           <w:rFonts w:ascii="Times New Roman" w:hAnsi="Times New Roman" w:eastAsia="Times New Roman" w:cs="Times New Roman"/>
-          <w:u w:val="single"/>
-        </w:rPr>
-      </w:pPr>
+          <w:sz w:val="22"/>
+          <w:szCs w:val="22"/>
+        </w:rPr>
+        <w:t xml:space="preserve">________________________</w:t>
+      </w:r>
     </w:p>
     <w:p>
       <w:pPr>
         <w:pStyle w:val="LeaseNormal"/>
+        <w:spacing w:before="0" w:after="180" w:line="240" w:lineRule="auto"/>
         <w:jc w:val="center"/>
+      </w:pPr>
+      <w:r>
         <w:rPr>
           <w:rFonts w:ascii="Times New Roman" w:hAnsi="Times New Roman" w:eastAsia="Times New Roman" w:cs="Times New Roman"/>
           <w:b/>
           <w:sz w:val="28"/>
           <w:szCs w:val="28"/>
         </w:rPr>
-      </w:pPr>
-      <w:r>
-        <w:rPr>
-          <w:rFonts w:ascii="Times New Roman" w:hAnsi="Times New Roman" w:eastAsia="Times New Roman" w:cs="Times New Roman"/>
-          <w:b/>
-          <w:sz w:val="28"/>
-          <w:szCs w:val="28"/>
-        </w:rPr>
-        <w:t>HỢP ĐỒNG CHO THUÊ NHÀ Ở</w:t>
+        <w:t xml:space="preserve">HỢP ĐỒNG CHO THUÊ, MƯỢN, Ở NHỜ</w:t>
       </w:r>
     </w:p>
     <w:p>
       <w:pPr>
         <w:pStyle w:val="LeaseNormal"/>
+        <w:spacing w:before="0" w:after="120" w:line="240" w:lineRule="auto"/>
+      </w:pPr>
+      <w:r>
         <w:rPr>
           <w:rFonts w:ascii="Times New Roman" w:hAnsi="Times New Roman" w:eastAsia="Times New Roman" w:cs="Times New Roman"/>
-        </w:rPr>
-      </w:pPr>
-      <w:r>
-        <w:rPr>
-          <w:rFonts w:ascii="Times New Roman" w:hAnsi="Times New Roman" w:eastAsia="Times New Roman" w:cs="Times New Roman"/>
-        </w:rPr>
-        <w:t xml:space="preserve">Ngày {signature_day} tháng {signature_month} năm {signature_year}</w:t>
+          <w:sz w:val="22"/>
+          <w:szCs w:val="22"/>
+        </w:rPr>
+        <w:t xml:space="preserve">Hôm nay, Ngày {signature_day} Tháng {signature_month} Năm {signature_year}, Tại {building_locality}</w:t>
       </w:r>
     </w:p>
     <w:p>
       <w:pPr>
         <w:pStyle w:val="LeaseNormal"/>
+        <w:spacing w:before="0" w:after="100" w:line="240" w:lineRule="auto"/>
+      </w:pPr>
+      <w:r>
         <w:rPr>
           <w:rFonts w:ascii="Times New Roman" w:hAnsi="Times New Roman" w:eastAsia="Times New Roman" w:cs="Times New Roman"/>
-        </w:rPr>
-      </w:pPr>
-      <w:r>
-        <w:rPr>
-          <w:rFonts w:ascii="Times New Roman" w:hAnsi="Times New Roman" w:eastAsia="Times New Roman" w:cs="Times New Roman"/>
-        </w:rPr>
-        <w:t xml:space="preserve">Tại nhà số: {building_address}</w:t>
+          <w:sz w:val="22"/>
+          <w:szCs w:val="22"/>
+        </w:rPr>
+        <w:t xml:space="preserve">1. ĐẠI DIỆN BÊN CHO THUÊ, MƯỢN, Ở NHỜ (Gọi tắt là bên A):</w:t>
       </w:r>
     </w:p>
     <w:p>
       <w:pPr>
         <w:pStyle w:val="LeaseNormal"/>
+        <w:spacing w:before="0" w:after="0" w:line="240" w:lineRule="auto"/>
+        <w:ind w:left="280"/>
+      </w:pPr>
+      <w:r>
         <w:rPr>
           <w:rFonts w:ascii="Times New Roman" w:hAnsi="Times New Roman" w:eastAsia="Times New Roman" w:cs="Times New Roman"/>
-        </w:rPr>
-      </w:pPr>
-      <w:r>
-        <w:rPr>
-          <w:rFonts w:ascii="Times New Roman" w:hAnsi="Times New Roman" w:eastAsia="Times New Roman" w:cs="Times New Roman"/>
-        </w:rPr>
-        <w:t>Chúng tôi gồm:</w:t>
+          <w:sz w:val="22"/>
+          <w:szCs w:val="22"/>
+        </w:rPr>
+        <w:t xml:space="preserve">Ông (Bà): {owner_name}        Sinh Năm: {owner_birth_year}</w:t>
       </w:r>
     </w:p>
     <w:p>
       <w:pPr>
-        <w:pStyle w:val="LeaseListParagraph"/>
-        <w:numPr>
-          <w:ilvl w:val="0"/>
-          <w:numId w:val="1"/>
-        </w:numPr>
-        <w:ind w:left="142" w:hanging="142"/>
+        <w:pStyle w:val="LeaseNormal"/>
+        <w:spacing w:before="0" w:after="0" w:line="240" w:lineRule="auto"/>
+      </w:pPr>
+      <w:r>
         <w:rPr>
           <w:rFonts w:ascii="Times New Roman" w:hAnsi="Times New Roman" w:eastAsia="Times New Roman" w:cs="Times New Roman"/>
-        </w:rPr>
-      </w:pPr>
-      <w:r>
-        <w:rPr>
-          <w:rFonts w:ascii="Times New Roman" w:hAnsi="Times New Roman" w:eastAsia="Times New Roman" w:cs="Times New Roman"/>
-        </w:rPr>
-        <w:t>ĐẠI DIỆN CHO THUÊ, MƯỢN, Ở NHỜ (Gọi tắt là bên A):</w:t>
+          <w:sz w:val="22"/>
+          <w:szCs w:val="22"/>
+        </w:rPr>
+        <w:t xml:space="preserve">-  CCCD: {owner_id_number}    Ngày cấp: {owner_id_issue_date}    Nơi Cấp: {owner_id_issue_place}</w:t>
       </w:r>
     </w:p>
     <w:p>
       <w:pPr>
-        <w:pStyle w:val="LeaseListParagraph"/>
-        <w:numPr>
-          <w:ilvl w:val="0"/>
-          <w:numId w:val="3"/>
-        </w:numPr>
-        <w:ind w:left="360"/>
+        <w:pStyle w:val="LeaseNormal"/>
+        <w:spacing w:before="0" w:after="0" w:line="240" w:lineRule="auto"/>
+      </w:pPr>
+      <w:r>
         <w:rPr>
           <w:rFonts w:ascii="Times New Roman" w:hAnsi="Times New Roman" w:eastAsia="Times New Roman" w:cs="Times New Roman"/>
-        </w:rPr>
-      </w:pPr>
-      <w:r>
-        <w:rPr>
-          <w:rFonts w:ascii="Times New Roman" w:hAnsi="Times New Roman" w:eastAsia="Times New Roman" w:cs="Times New Roman"/>
-        </w:rPr>
-        <w:t xml:space="preserve">Ông (Bà): {owner_name}    Sinh Năm: {owner_birth_year}</w:t>
+          <w:sz w:val="22"/>
+          <w:szCs w:val="22"/>
+        </w:rPr>
+        <w:t xml:space="preserve">-  Hiện thường trú: {owner_permanent_address}</w:t>
       </w:r>
     </w:p>
     <w:p>
       <w:pPr>
-        <w:pStyle w:val="LeaseListParagraph"/>
-        <w:numPr>
-          <w:ilvl w:val="0"/>
-          <w:numId w:val="3"/>
-        </w:numPr>
-        <w:ind w:left="284" w:hanging="284"/>
+        <w:pStyle w:val="LeaseNormal"/>
+        <w:spacing w:before="0" w:after="0" w:line="240" w:lineRule="auto"/>
+      </w:pPr>
+      <w:r>
         <w:rPr>
           <w:rFonts w:ascii="Times New Roman" w:hAnsi="Times New Roman" w:eastAsia="Times New Roman" w:cs="Times New Roman"/>
-        </w:rPr>
-      </w:pPr>
-      <w:r>
-        <w:rPr>
-          <w:rFonts w:ascii="Times New Roman" w:hAnsi="Times New Roman" w:eastAsia="Times New Roman" w:cs="Times New Roman"/>
-        </w:rPr>
-        <w:t xml:space="preserve">CCCD: {owner_id_number}    Ngày cấp: {owner_id_issue_date}    Nơi Cấp: {owner_id_issue_place}</w:t>
+          <w:sz w:val="22"/>
+          <w:szCs w:val="22"/>
+        </w:rPr>
+        <w:t xml:space="preserve">2. ĐẠI DIỆN BÊN THUÊ, MƯỢN, Ở NHỜ (Gọi tắt là bên B):</w:t>
       </w:r>
     </w:p>
     <w:p>
       <w:pPr>
-        <w:pStyle w:val="LeaseListParagraph"/>
-        <w:numPr>
-          <w:ilvl w:val="0"/>
-          <w:numId w:val="3"/>
-        </w:numPr>
-        <w:ind w:left="284" w:hanging="284"/>
+        <w:pStyle w:val="LeaseNormal"/>
+        <w:spacing w:before="0" w:after="0" w:line="240" w:lineRule="auto"/>
+        <w:ind w:left="280"/>
+      </w:pPr>
+      <w:r>
         <w:rPr>
           <w:rFonts w:ascii="Times New Roman" w:hAnsi="Times New Roman" w:eastAsia="Times New Roman" w:cs="Times New Roman"/>
-        </w:rPr>
-      </w:pPr>
-      <w:r>
-        <w:rPr>
-          <w:rFonts w:ascii="Times New Roman" w:hAnsi="Times New Roman" w:eastAsia="Times New Roman" w:cs="Times New Roman"/>
-        </w:rPr>
-        <w:t xml:space="preserve">Hiện thường trú: {owner_permanent_address}</w:t>
+          <w:sz w:val="22"/>
+          <w:szCs w:val="22"/>
+        </w:rPr>
+        <w:t xml:space="preserve">Ông (Bà): {full_name}        Sinh năm: {date_of_birth}</w:t>
       </w:r>
     </w:p>
     <w:p>
       <w:pPr>
-        <w:pStyle w:val="LeaseListParagraph"/>
-        <w:numPr>
-          <w:ilvl w:val="0"/>
-          <w:numId w:val="3"/>
-        </w:numPr>
-        <w:ind w:left="284" w:hanging="284"/>
+        <w:pStyle w:val="LeaseNormal"/>
+        <w:spacing w:before="0" w:after="0" w:line="240" w:lineRule="auto"/>
+      </w:pPr>
+      <w:r>
         <w:rPr>
           <w:rFonts w:ascii="Times New Roman" w:hAnsi="Times New Roman" w:eastAsia="Times New Roman" w:cs="Times New Roman"/>
-        </w:rPr>
-      </w:pPr>
-      <w:r>
-        <w:rPr>
-          <w:rFonts w:ascii="Times New Roman" w:hAnsi="Times New Roman" w:eastAsia="Times New Roman" w:cs="Times New Roman"/>
-        </w:rPr>
-        <w:t xml:space="preserve">Là chủ sở hữu căn nhà: </w:t>
-      </w:r>
-      <w:r>
-        <w:rPr>
-          <w:rFonts w:ascii="Times New Roman" w:hAnsi="Times New Roman" w:eastAsia="Times New Roman" w:cs="Times New Roman"/>
-        </w:rPr>
-        <w:t xml:space="preserve">{building_address}</w:t>
+          <w:sz w:val="22"/>
+          <w:szCs w:val="22"/>
+        </w:rPr>
+        <w:t xml:space="preserve">-  CCCD: {customer_id_number}    Ngày cấp: {customer_id_issue_date}    Nơi cấp: {customer_id_issue_place}</w:t>
       </w:r>
     </w:p>
     <w:p>
       <w:pPr>
-        <w:pStyle w:val="LeaseListParagraph"/>
-        <w:numPr>
-          <w:ilvl w:val="0"/>
-          <w:numId w:val="1"/>
-        </w:numPr>
-        <w:ind w:left="284" w:hanging="284"/>
+        <w:pStyle w:val="LeaseNormal"/>
+        <w:spacing w:before="0" w:after="0" w:line="240" w:lineRule="auto"/>
+      </w:pPr>
+      <w:r>
         <w:rPr>
           <w:rFonts w:ascii="Times New Roman" w:hAnsi="Times New Roman" w:eastAsia="Times New Roman" w:cs="Times New Roman"/>
-        </w:rPr>
-      </w:pPr>
-      <w:r>
-        <w:rPr>
-          <w:rFonts w:ascii="Times New Roman" w:hAnsi="Times New Roman" w:eastAsia="Times New Roman" w:cs="Times New Roman"/>
-        </w:rPr>
-        <w:t>ĐẠI DIỆN BÊN THUÊ, MƯỢN, Ở NHỜ (Gọi tắt là bên B):</w:t>
+          <w:sz w:val="22"/>
+          <w:szCs w:val="22"/>
+        </w:rPr>
+        <w:t xml:space="preserve">-  Hiện thường trú: {customer_permanent_address}</w:t>
       </w:r>
     </w:p>
     <w:p>
       <w:pPr>
-        <w:pStyle w:val="LeaseListParagraph"/>
-        <w:numPr>
-          <w:ilvl w:val="0"/>
-          <w:numId w:val="4"/>
-        </w:numPr>
-        <w:ind w:left="284" w:hanging="284"/>
+        <w:pStyle w:val="LeaseNormal"/>
+        <w:spacing w:before="0" w:after="120" w:line="240" w:lineRule="auto"/>
+      </w:pPr>
+      <w:r>
         <w:rPr>
           <w:rFonts w:ascii="Times New Roman" w:hAnsi="Times New Roman" w:eastAsia="Times New Roman" w:cs="Times New Roman"/>
-        </w:rPr>
-      </w:pPr>
-      <w:r>
-        <w:rPr>
-          <w:rFonts w:ascii="Times New Roman" w:hAnsi="Times New Roman" w:eastAsia="Times New Roman" w:cs="Times New Roman"/>
-        </w:rPr>
-        <w:t xml:space="preserve">Ông (Bà): {full_name}    Sinh năm: {customer_birth_year}</w:t>
+          <w:sz w:val="22"/>
+          <w:szCs w:val="22"/>
+        </w:rPr>
+        <w:t xml:space="preserve">Bằng hợp đồng này, bên A đồng ý cho bên B thuê, mượn, ở nhờ nhà với những thỏa thuận sau đây:</w:t>
       </w:r>
     </w:p>
     <w:p>
       <w:pPr>
-        <w:pStyle w:val="LeaseListParagraph"/>
-        <w:numPr>
-          <w:ilvl w:val="0"/>
-          <w:numId w:val="3"/>
-        </w:numPr>
-        <w:ind w:left="284" w:hanging="284"/>
+        <w:pStyle w:val="LeaseNormal"/>
+        <w:spacing w:before="0" w:after="0" w:line="240" w:lineRule="auto"/>
+      </w:pPr>
+      <w:r>
         <w:rPr>
           <w:rFonts w:ascii="Times New Roman" w:hAnsi="Times New Roman" w:eastAsia="Times New Roman" w:cs="Times New Roman"/>
-        </w:rPr>
-      </w:pPr>
-      <w:r>
-        <w:rPr>
-          <w:rFonts w:ascii="Times New Roman" w:hAnsi="Times New Roman" w:eastAsia="Times New Roman" w:cs="Times New Roman"/>
-        </w:rPr>
-        <w:t xml:space="preserve">CCCD: {customer_id_number}    Ngày cấp: {customer_id_issue_date}    Nơi cấp: {customer_id_issue_place}</w:t>
+          <w:sz w:val="22"/>
+          <w:szCs w:val="22"/>
+        </w:rPr>
+        <w:t xml:space="preserve">3. Đối tượng của hợp đồng này là: Một phần hoặc toàn bộ căn nhà số: {building_address}</w:t>
       </w:r>
     </w:p>
     <w:p>
       <w:pPr>
-        <w:pStyle w:val="LeaseListParagraph"/>
-        <w:numPr>
-          <w:ilvl w:val="0"/>
-          <w:numId w:val="3"/>
-        </w:numPr>
-        <w:ind w:left="284" w:hanging="284"/>
+        <w:pStyle w:val="LeaseNormal"/>
+        <w:spacing w:before="0" w:after="0" w:line="240" w:lineRule="auto"/>
+        <w:ind w:left="280"/>
+      </w:pPr>
+      <w:r>
         <w:rPr>
           <w:rFonts w:ascii="Times New Roman" w:hAnsi="Times New Roman" w:eastAsia="Times New Roman" w:cs="Times New Roman"/>
-        </w:rPr>
-      </w:pPr>
-      <w:r>
-        <w:rPr>
-          <w:rFonts w:ascii="Times New Roman" w:hAnsi="Times New Roman" w:eastAsia="Times New Roman" w:cs="Times New Roman"/>
-        </w:rPr>
-        <w:t xml:space="preserve">Hiện thường trú: {customer_permanent_address}</w:t>
+          <w:sz w:val="22"/>
+          <w:szCs w:val="22"/>
+        </w:rPr>
+        <w:t xml:space="preserve">Bên cho thuê, mượn, cho ở nhờ là người đứng tên chủ quyền sở hữu nhà ở.</w:t>
       </w:r>
     </w:p>
     <w:p>
       <w:pPr>
         <w:pStyle w:val="LeaseNormal"/>
+        <w:spacing w:before="0" w:after="0" w:line="240" w:lineRule="auto"/>
+      </w:pPr>
+      <w:r>
         <w:rPr>
           <w:rFonts w:ascii="Times New Roman" w:hAnsi="Times New Roman" w:eastAsia="Times New Roman" w:cs="Times New Roman"/>
-        </w:rPr>
-      </w:pPr>
-      <w:r>
-        <w:rPr>
-          <w:rFonts w:ascii="Times New Roman" w:hAnsi="Times New Roman" w:eastAsia="Times New Roman" w:cs="Times New Roman"/>
-        </w:rPr>
-        <w:t>Hai bên tự nguyện thỏa thuận giao kết hợp đồng cho thuê, mượn, ở nhờ với các nội dụng sau:</w:t>
+          <w:sz w:val="22"/>
+          <w:szCs w:val="22"/>
+        </w:rPr>
+        <w:t xml:space="preserve">4. Mục đích: để ở và đăng ký tạm trú.</w:t>
       </w:r>
     </w:p>
     <w:p>
       <w:pPr>
         <w:pStyle w:val="LeaseNormal"/>
+        <w:spacing w:before="0" w:after="0" w:line="240" w:lineRule="auto"/>
+        <w:ind w:left="280"/>
+      </w:pPr>
+      <w:r>
         <w:rPr>
           <w:rFonts w:ascii="Times New Roman" w:hAnsi="Times New Roman" w:eastAsia="Times New Roman" w:cs="Times New Roman"/>
-        </w:rPr>
-      </w:pPr>
-      <w:r>
-        <w:rPr>
-          <w:rFonts w:ascii="Times New Roman" w:hAnsi="Times New Roman" w:eastAsia="Times New Roman" w:cs="Times New Roman"/>
-          <w:b/>
-        </w:rPr>
-        <w:t xml:space="preserve">Điều 1: </w:t>
-      </w:r>
-      <w:r>
-        <w:rPr>
-          <w:rFonts w:ascii="Times New Roman" w:hAnsi="Times New Roman" w:eastAsia="Times New Roman" w:cs="Times New Roman"/>
-        </w:rPr>
-        <w:t>Bên A đồng ý cho bên B thuê, mượn, ở nhờ và đăng ký tạm trú tại phòng</w:t>
-      </w:r>
-      <w:r>
-        <w:rPr>
-          <w:rFonts w:ascii="Times New Roman" w:hAnsi="Times New Roman" w:eastAsia="Times New Roman" w:cs="Times New Roman"/>
-        </w:rPr>
-        <w:t xml:space="preserve"> </w:t>
-      </w:r>
-      <w:r>
-        <w:rPr>
-          <w:rFonts w:ascii="Times New Roman" w:hAnsi="Times New Roman" w:eastAsia="Times New Roman" w:cs="Times New Roman"/>
-        </w:rPr>
-        <w:t xml:space="preserve">{room_number}</w:t>
+          <w:sz w:val="22"/>
+          <w:szCs w:val="22"/>
+        </w:rPr>
+        <w:t xml:space="preserve">Bên A đồng ý cho bên B được thuê, mượn, ở nhờ và đăng ký tạm trú vào địa chỉ căn nhà trên.</w:t>
       </w:r>
     </w:p>
     <w:p>
       <w:pPr>
         <w:pStyle w:val="LeaseNormal"/>
+        <w:spacing w:before="0" w:after="0" w:line="240" w:lineRule="auto"/>
+        <w:ind w:left="280"/>
+      </w:pPr>
+      <w:r>
         <w:rPr>
           <w:rFonts w:ascii="Times New Roman" w:hAnsi="Times New Roman" w:eastAsia="Times New Roman" w:cs="Times New Roman"/>
-        </w:rPr>
-      </w:pPr>
-      <w:r>
-        <w:rPr>
-          <w:rFonts w:ascii="Times New Roman" w:hAnsi="Times New Roman" w:eastAsia="Times New Roman" w:cs="Times New Roman"/>
-        </w:rPr>
-        <w:t xml:space="preserve">Căn nhà số: </w:t>
-      </w:r>
-      <w:r>
-        <w:rPr>
-          <w:rFonts w:ascii="Times New Roman" w:hAnsi="Times New Roman" w:eastAsia="Times New Roman" w:cs="Times New Roman"/>
-        </w:rPr>
-        <w:t xml:space="preserve">{building_address}</w:t>
+          <w:sz w:val="22"/>
+          <w:szCs w:val="22"/>
+        </w:rPr>
+        <w:t xml:space="preserve">(kèm theo danh sách số người tạm trú được ghi trên tờ khai thay đổi thông tin cư trú)</w:t>
       </w:r>
     </w:p>
     <w:p>
       <w:pPr>
         <w:pStyle w:val="LeaseNormal"/>
+        <w:spacing w:before="0" w:after="0" w:line="240" w:lineRule="auto"/>
+        <w:ind w:left="280"/>
+      </w:pPr>
+      <w:r>
         <w:rPr>
           <w:rFonts w:ascii="Times New Roman" w:hAnsi="Times New Roman" w:eastAsia="Times New Roman" w:cs="Times New Roman"/>
-        </w:rPr>
-      </w:pPr>
-      <w:r>
-        <w:rPr>
-          <w:rFonts w:ascii="Times New Roman" w:hAnsi="Times New Roman" w:eastAsia="Times New Roman" w:cs="Times New Roman"/>
-        </w:rPr>
-        <w:t>Với mục đích để ở trong thờ</w:t>
-      </w:r>
-      <w:r>
-        <w:rPr>
-          <w:rFonts w:ascii="Times New Roman" w:hAnsi="Times New Roman" w:eastAsia="Times New Roman" w:cs="Times New Roman"/>
-        </w:rPr>
-        <w:t xml:space="preserve">i gian </w:t>
-      </w:r>
-      <w:r>
-        <w:rPr>
-          <w:rFonts w:ascii="Times New Roman" w:hAnsi="Times New Roman" w:eastAsia="Times New Roman" w:cs="Times New Roman"/>
-        </w:rPr>
-        <w:t xml:space="preserve">{duration_months}</w:t>
-      </w:r>
-      <w:r>
-        <w:rPr>
-          <w:rFonts w:ascii="Times New Roman" w:hAnsi="Times New Roman" w:eastAsia="Times New Roman" w:cs="Times New Roman"/>
-        </w:rPr>
-        <w:t xml:space="preserve"> tháng, từ ngày: </w:t>
-      </w:r>
-      <w:r>
-        <w:rPr>
-          <w:rFonts w:ascii="Times New Roman" w:hAnsi="Times New Roman" w:eastAsia="Times New Roman" w:cs="Times New Roman"/>
-        </w:rPr>
-        <w:t xml:space="preserve">{download_date}</w:t>
-      </w:r>
-      <w:r>
-        <w:rPr>
-          <w:rFonts w:ascii="Times New Roman" w:hAnsi="Times New Roman" w:eastAsia="Times New Roman" w:cs="Times New Roman"/>
-        </w:rPr>
-        <w:t>.</w:t>
+          <w:sz w:val="22"/>
+          <w:szCs w:val="22"/>
+        </w:rPr>
+        <w:t xml:space="preserve">Thời hạn mượn: {duration_months} tháng (từ {download_date} đến {lease_end_date})</w:t>
       </w:r>
     </w:p>
     <w:p>
       <w:pPr>
         <w:pStyle w:val="LeaseNormal"/>
+        <w:spacing w:before="0" w:after="0" w:line="240" w:lineRule="auto"/>
+      </w:pPr>
+      <w:r>
         <w:rPr>
           <w:rFonts w:ascii="Times New Roman" w:hAnsi="Times New Roman" w:eastAsia="Times New Roman" w:cs="Times New Roman"/>
-        </w:rPr>
-      </w:pPr>
-      <w:r>
-        <w:rPr>
-          <w:rFonts w:ascii="Times New Roman" w:hAnsi="Times New Roman" w:eastAsia="Times New Roman" w:cs="Times New Roman"/>
-          <w:b/>
-        </w:rPr>
-        <w:t xml:space="preserve">Điều 2: </w:t>
-      </w:r>
-      <w:r>
-        <w:rPr>
-          <w:rFonts w:ascii="Times New Roman" w:hAnsi="Times New Roman" w:eastAsia="Times New Roman" w:cs="Times New Roman"/>
-        </w:rPr>
-        <w:t>Giá cả cho thuê, Mượn, ở nhờ nhà được hai bên thỏa thuận</w:t>
+          <w:sz w:val="22"/>
+          <w:szCs w:val="22"/>
+        </w:rPr>
+        <w:t xml:space="preserve">5. Bên A và Bên B: cam kết chịu trách nhiệm trước pháp luật về tất cả những thỏa thuận đã ghi trong hợp đồng.</w:t>
       </w:r>
     </w:p>
     <w:p>
       <w:pPr>
         <w:pStyle w:val="LeaseNormal"/>
+        <w:spacing w:before="0" w:after="700" w:line="240" w:lineRule="auto"/>
+        <w:ind w:left="280"/>
+      </w:pPr>
+      <w:r>
         <w:rPr>
           <w:rFonts w:ascii="Times New Roman" w:hAnsi="Times New Roman" w:eastAsia="Times New Roman" w:cs="Times New Roman"/>
-        </w:rPr>
+          <w:sz w:val="22"/>
+          <w:szCs w:val="22"/>
+        </w:rPr>
+        <w:t xml:space="preserve">Hợp đồng được lập thành 2 bản, các bản đều giống nhau</w:t>
+      </w:r>
+    </w:p>
+    <w:tbl>
+      <w:tblPr>
+        <w:tblW w:w="9360" w:type="dxa"/>
+        <w:tblLayout w:type="fixed"/>
+        <w:tblBorders>
+          <w:top w:val="nil"/>
+          <w:left w:val="nil"/>
+          <w:bottom w:val="nil"/>
+          <w:right w:val="nil"/>
+          <w:insideH w:val="nil"/>
+          <w:insideV w:val="nil"/>
+        </w:tblBorders>
+      </w:tblPr>
+      <w:tblGrid>
+        <w:gridCol w:w="4680"/>
+        <w:gridCol w:w="4680"/>
+      </w:tblGrid>
+      <w:tr>
+        <w:tc>
+          <w:tcPr>
+            <w:tcW w:w="4680" w:type="dxa"/>
+          </w:tcPr>
+          <w:p>
+            <w:pPr>
+              <w:pStyle w:val="LeaseNormal"/>
+              <w:spacing w:before="0" w:after="160" w:line="240" w:lineRule="auto"/>
+              <w:jc w:val="center"/>
+            </w:pPr>
+            <w:r>
+              <w:rPr>
+                <w:rFonts w:ascii="Times New Roman" w:hAnsi="Times New Roman" w:eastAsia="Times New Roman" w:cs="Times New Roman"/>
+                <w:sz w:val="22"/>
+                <w:szCs w:val="22"/>
+              </w:rPr>
+              <w:t xml:space="preserve">Bên cho thuê, mượn nhà ở</w:t>
+            </w:r>
+          </w:p>
+          <w:p>
+            <w:pPr>
+              <w:pStyle w:val="LeaseNormal"/>
+              <w:spacing w:before="0" w:after="160" w:line="240" w:lineRule="auto"/>
+              <w:jc w:val="center"/>
+            </w:pPr>
+            <w:r>
+              <w:rPr>
+                <w:rFonts w:ascii="Times New Roman" w:hAnsi="Times New Roman" w:eastAsia="Times New Roman" w:cs="Times New Roman"/>
+                <w:sz w:val="22"/>
+                <w:szCs w:val="22"/>
+              </w:rPr>
+              <w:t xml:space="preserve">(Bên A)</w:t>
+            </w:r>
+          </w:p>
+          <w:p>
+            <w:pPr>
+              <w:pStyle w:val="LeaseNormal"/>
+              <w:spacing w:before="0" w:after="160" w:line="240" w:lineRule="auto"/>
+              <w:jc w:val="center"/>
+            </w:pPr>
+            <w:r>
+              <w:rPr>
+                <w:rFonts w:ascii="Times New Roman" w:hAnsi="Times New Roman" w:eastAsia="Times New Roman" w:cs="Times New Roman"/>
+                <w:sz w:val="22"/>
+                <w:szCs w:val="22"/>
+              </w:rPr>
+              <w:t xml:space="preserve">(ký và ghi rõ họ tên)</w:t>
+            </w:r>
+          </w:p>
+        </w:tc>
+        <w:tc>
+          <w:tcPr>
+            <w:tcW w:w="4680" w:type="dxa"/>
+          </w:tcPr>
+          <w:p>
+            <w:pPr>
+              <w:pStyle w:val="LeaseNormal"/>
+              <w:spacing w:before="0" w:after="160" w:line="240" w:lineRule="auto"/>
+              <w:jc w:val="center"/>
+            </w:pPr>
+            <w:r>
+              <w:rPr>
+                <w:rFonts w:ascii="Times New Roman" w:hAnsi="Times New Roman" w:eastAsia="Times New Roman" w:cs="Times New Roman"/>
+                <w:sz w:val="22"/>
+                <w:szCs w:val="22"/>
+              </w:rPr>
+              <w:t xml:space="preserve">Bên thuê, mượn nhà ở nhờ</w:t>
+            </w:r>
+          </w:p>
+          <w:p>
+            <w:pPr>
+              <w:pStyle w:val="LeaseNormal"/>
+              <w:spacing w:before="0" w:after="160" w:line="240" w:lineRule="auto"/>
+              <w:jc w:val="center"/>
+            </w:pPr>
+            <w:r>
+              <w:rPr>
+                <w:rFonts w:ascii="Times New Roman" w:hAnsi="Times New Roman" w:eastAsia="Times New Roman" w:cs="Times New Roman"/>
+                <w:sz w:val="22"/>
+                <w:szCs w:val="22"/>
+              </w:rPr>
+              <w:t xml:space="preserve">(Bên B)</w:t>
+            </w:r>
+          </w:p>
+          <w:p>
+            <w:pPr>
+              <w:pStyle w:val="LeaseNormal"/>
+              <w:spacing w:before="0" w:after="160" w:line="240" w:lineRule="auto"/>
+              <w:jc w:val="center"/>
+            </w:pPr>
+            <w:r>
+              <w:rPr>
+                <w:rFonts w:ascii="Times New Roman" w:hAnsi="Times New Roman" w:eastAsia="Times New Roman" w:cs="Times New Roman"/>
+                <w:sz w:val="22"/>
+                <w:szCs w:val="22"/>
+              </w:rPr>
+              <w:t xml:space="preserve">(ký và ghi rõ họ tên)</w:t>
+            </w:r>
+          </w:p>
+        </w:tc>
+      </w:tr>
+    </w:tbl>
+    <w:p>
+      <w:pPr>
+        <w:pStyle w:val="LeaseNormal"/>
+        <w:spacing w:before="0" w:after="0" w:line="240" w:lineRule="auto"/>
       </w:pPr>
       <w:r>
         <w:rPr>
           <w:rFonts w:ascii="Times New Roman" w:hAnsi="Times New Roman" w:eastAsia="Times New Roman" w:cs="Times New Roman"/>
-          <w:b/>
-        </w:rPr>
-        <w:t xml:space="preserve">Điều 3: </w:t>
-      </w:r>
-      <w:r>
-        <w:rPr>
-          <w:rFonts w:ascii="Times New Roman" w:hAnsi="Times New Roman" w:eastAsia="Times New Roman" w:cs="Times New Roman"/>
-        </w:rPr>
-        <w:t>Trách nhiệm bên A: giao phòng và trang thiết bị tiện nghi trong phòng cho bên B kể từ ngày ký hợp đồng</w:t>
-      </w:r>
-    </w:p>
-    <w:p>
-      <w:pPr>
-        <w:pStyle w:val="LeaseNormal"/>
-        <w:rPr>
-          <w:rFonts w:ascii="Times New Roman" w:hAnsi="Times New Roman" w:eastAsia="Times New Roman" w:cs="Times New Roman"/>
-        </w:rPr>
-      </w:pPr>
-      <w:r>
-        <w:rPr>
-          <w:rFonts w:ascii="Times New Roman" w:hAnsi="Times New Roman" w:eastAsia="Times New Roman" w:cs="Times New Roman"/>
-          <w:b/>
-        </w:rPr>
-        <w:t>Điều 4:</w:t>
-      </w:r>
-      <w:r>
-        <w:rPr>
-          <w:rFonts w:ascii="Times New Roman" w:hAnsi="Times New Roman" w:eastAsia="Times New Roman" w:cs="Times New Roman"/>
-        </w:rPr>
-        <w:t xml:space="preserve"> Trách nhiệm bên B: sử dụng phòng để ở đúng mục đích, nội dung và có trách nhiệm bảo quản giữ nguyên cấu trúc của phòng, đảm bảo vệ sinh, an ninh trật tự.</w:t>
-      </w:r>
-    </w:p>
-    <w:p>
-      <w:pPr>
-        <w:pStyle w:val="LeaseNormal"/>
-        <w:rPr>
-          <w:rFonts w:ascii="Times New Roman" w:hAnsi="Times New Roman" w:eastAsia="Times New Roman" w:cs="Times New Roman"/>
-        </w:rPr>
-      </w:pPr>
-      <w:r>
-        <w:rPr>
-          <w:rFonts w:ascii="Times New Roman" w:hAnsi="Times New Roman" w:eastAsia="Times New Roman" w:cs="Times New Roman"/>
-          <w:b/>
-        </w:rPr>
-        <w:t>Điều 5:</w:t>
-      </w:r>
-      <w:r>
-        <w:rPr>
-          <w:rFonts w:ascii="Times New Roman" w:hAnsi="Times New Roman" w:eastAsia="Times New Roman" w:cs="Times New Roman"/>
-        </w:rPr>
-        <w:t xml:space="preserve"> Hai bên cam kết thực hiện đầy đủ các điều khoản đã thỏa thuận trường hợp một trong 02 bên không thực hiện theo đúng các nội dung trong hợp đồng đã thỏa thuận thì phải có trách nhiệm bồi thường mọi thiệt hại gây ra.</w:t>
-      </w:r>
-    </w:p>
-    <w:p>
-      <w:pPr>
-        <w:pStyle w:val="LeaseNormal"/>
-        <w:rPr>
-          <w:rFonts w:ascii="Times New Roman" w:hAnsi="Times New Roman" w:eastAsia="Times New Roman" w:cs="Times New Roman"/>
-        </w:rPr>
-      </w:pPr>
-      <w:r>
-        <w:rPr>
-          <w:rFonts w:ascii="Times New Roman" w:hAnsi="Times New Roman" w:eastAsia="Times New Roman" w:cs="Times New Roman"/>
-        </w:rPr>
-        <w:t>Hợp đồng này được lập thành 02 bản có giá trị tương đương nhau, có hiệu lực kế từ ngày ký và được chấm dứt khi 02 bên cùng thỏa thuận, mỗi bên giữ 01 (một) bản để thực hiện ./.</w:t>
-      </w:r>
-    </w:p>
-    <w:p>
-      <w:pPr>
-        <w:pStyle w:val="LeaseNormal"/>
-        <w:rPr>
-          <w:rFonts w:ascii="Times New Roman" w:hAnsi="Times New Roman" w:eastAsia="Times New Roman" w:cs="Times New Roman"/>
-        </w:rPr>
-      </w:pPr>
-      <w:r>
-        <w:rPr>
-          <w:rFonts w:ascii="Times New Roman" w:hAnsi="Times New Roman" w:eastAsia="Times New Roman" w:cs="Times New Roman"/>
-        </w:rPr>
-        <w:t xml:space="preserve">                  BÊN A                                                                                                   BÊN B</w:t>
+          <w:sz w:val="22"/>
+          <w:szCs w:val="22"/>
+        </w:rPr>
+        <w:t xml:space="preserve"/>
       </w:r>
     </w:p>
     <w:sectPr>

</xml_diff>